<commit_message>
docs: record L0 scope decision and successful CI review
</commit_message>
<xml_diff>
--- a/docs/Plan_Implementations_Restantes_2026-10.docx
+++ b/docs/Plan_Implementations_Restantes_2026-10.docx
@@ -78,7 +78,7 @@
           <w:sz w:val="21"/>
           <w:szCs w:val="21"/>
         </w:rPr>
-        <w:t xml:space="preserve">Statut : L0 VALIDÉ LOCALEMENT, livraison/CI en préparation ; L1–L11 PLANIFIÉS. Voir docs/suivi/LOT_L0.md et docs/REVUE_L0_2026-10.md. Aucun déploiement attesté par ce plan.</w:t>
+        <w:t xml:space="preserve">Statut : L0 VALIDÉ LOCAL + CI, PR #178 ouverte, fusion à effectuer ; L1–L11 PLANIFIÉS. Voir docs/suivi/LOT_L0.md et docs/REVUE_L0_2026-10.md. Aucun déploiement attesté par ce plan.</w:t>
       </w:r>
     </w:p>
     <w:p>
@@ -135,7 +135,7 @@
           <w:sz w:val="21"/>
           <w:szCs w:val="21"/>
         </w:rPr>
-        <w:t xml:space="preserve">Statut : L0 VALIDÉ LOCALEMENT, livraison/CI en préparation ; L1–L11 PLANIFIÉS. Voir docs/suivi/LOT_L0.md et docs/REVUE_L0_2026-10.md. Aucun déploiement attesté par ce plan.</w:t>
+        <w:t xml:space="preserve">Statut : L0 VALIDÉ LOCAL + CI, PR #178 ouverte, fusion à effectuer ; L1–L11 PLANIFIÉS. Voir docs/suivi/LOT_L0.md et docs/REVUE_L0_2026-10.md. Aucun déploiement attesté par ce plan.</w:t>
       </w:r>
     </w:p>
     <w:p>
@@ -217,7 +217,7 @@
           <w:sz w:val="21"/>
           <w:szCs w:val="21"/>
         </w:rPr>
-        <w:t xml:space="preserve">Quatre corrections sont regroupées sur la branche L0 feat/l0-baseline-review : contrôle du statut/rôle à chaque requête protégée, remboursement WALLET entrant atomique, réconciliation PENDING/PROCESSING, réservation RDV concurrente sous verrou médecin. Résultats locaux du 6 octobre : 390 tests API + 50 tests web, 8 E2E, lint/typecheck et builds verts ; 29 migrations, schéma validé et aucune dérive constatée. Migration 28→29 répétée sur données synthétiques ; revue du diff consignée. CI candidate et fournisseurs réels à valider séparément ; aucune fusion/déploiement.</w:t>
+        <w:t xml:space="preserve">Quatre corrections sont regroupées sur la branche L0 feat/l0-baseline-review : contrôle du statut/rôle à chaque requête protégée, remboursement WALLET entrant atomique, réconciliation PENDING/PROCESSING, réservation RDV concurrente sous verrou médecin. Résultats locaux du 6 octobre : 390 tests API + 50 tests web, 8 E2E, lint/typecheck et builds verts ; 29 migrations, schéma validé et aucune dérive constatée. Migration 28→29 répétée sur données synthétiques ; revue du diff consignée. CI candidate 6edcd427 verte (build-and-test et e2e), PR #178 ouverte ; fournisseurs réels à valider séparément, aucune fusion/déploiement. Revérifier les checks de tête avant fusion.</w:t>
       </w:r>
     </w:p>
     <w:p>
@@ -1232,7 +1232,7 @@
                 <w:sz w:val="18"/>
                 <w:szCs w:val="18"/>
               </w:rPr>
-              <w:t xml:space="preserve">Revue et baseline locales validées ; livraison/CI à finaliser</w:t>
+              <w:t xml:space="preserve">Revue, baseline locale et CI validées ; PR #178 ouverte, fusion à effectuer</w:t>
             </w:r>
           </w:p>
         </w:tc>

</xml_diff>

<commit_message>
docs: track L0 replacement pull request without stale delivery claims
</commit_message>
<xml_diff>
--- a/docs/Plan_Implementations_Restantes_2026-10.docx
+++ b/docs/Plan_Implementations_Restantes_2026-10.docx
@@ -78,7 +78,7 @@
           <w:sz w:val="21"/>
           <w:szCs w:val="21"/>
         </w:rPr>
-        <w:t xml:space="preserve">Statut : L0 VALIDÉ LOCAL + CI, PR #178 ouverte, fusion à effectuer ; L1–L11 PLANIFIÉS. Voir docs/suivi/LOT_L0.md et docs/REVUE_L0_2026-10.md. Aucun déploiement attesté par ce plan.</w:t>
+        <w:t xml:space="preserve">Statut : L0 VALIDÉ LOCAL + CI, PR de reprise à contrôler sur la branche, fusion à effectuer ; L1–L11 PLANIFIÉS. Voir docs/suivi/LOT_L0.md et docs/REVUE_L0_2026-10.md. Aucun déploiement attesté par ce plan.</w:t>
       </w:r>
     </w:p>
     <w:p>
@@ -135,7 +135,7 @@
           <w:sz w:val="21"/>
           <w:szCs w:val="21"/>
         </w:rPr>
-        <w:t xml:space="preserve">Statut : L0 VALIDÉ LOCAL + CI, PR #178 ouverte, fusion à effectuer ; L1–L11 PLANIFIÉS. Voir docs/suivi/LOT_L0.md et docs/REVUE_L0_2026-10.md. Aucun déploiement attesté par ce plan.</w:t>
+        <w:t xml:space="preserve">Statut : L0 VALIDÉ LOCAL + CI, PR de reprise à contrôler sur la branche, fusion à effectuer ; L1–L11 PLANIFIÉS. Voir docs/suivi/LOT_L0.md et docs/REVUE_L0_2026-10.md. Aucun déploiement attesté par ce plan.</w:t>
       </w:r>
     </w:p>
     <w:p>
@@ -217,7 +217,7 @@
           <w:sz w:val="21"/>
           <w:szCs w:val="21"/>
         </w:rPr>
-        <w:t xml:space="preserve">Quatre corrections sont regroupées sur la branche L0 feat/l0-baseline-review : contrôle du statut/rôle à chaque requête protégée, remboursement WALLET entrant atomique, réconciliation PENDING/PROCESSING, réservation RDV concurrente sous verrou médecin. Résultats locaux du 6 octobre : 390 tests API + 50 tests web, 8 E2E, lint/typecheck et builds verts ; 29 migrations, schéma validé et aucune dérive constatée. Migration 28→29 répétée sur données synthétiques ; revue du diff consignée. CI candidate 6edcd427 verte (build-and-test et e2e), PR #178 ouverte ; fournisseurs réels à valider séparément, aucune fusion/déploiement. Revérifier les checks de tête avant fusion.</w:t>
+        <w:t xml:space="preserve">Quatre corrections sont regroupées sur la branche L0 feat/l0-baseline-review : contrôle du statut/rôle à chaque requête protégée, remboursement WALLET entrant atomique, réconciliation PENDING/PROCESSING, réservation RDV concurrente sous verrou médecin. Résultats locaux du 6 octobre : 390 tests API + 50 tests web, 8 E2E, lint/typecheck et builds verts ; 29 migrations, schéma validé et aucune dérive constatée. Migration 28→29 répétée sur données synthétiques ; revue du diff consignée. CI candidate 6edcd427 verte (build-and-test et e2e), PR de reprise à contrôler sur la branche ; fournisseurs réels à valider séparément, aucune fusion/déploiement. Revérifier les checks de tête avant fusion.</w:t>
       </w:r>
     </w:p>
     <w:p>
@@ -1232,7 +1232,7 @@
                 <w:sz w:val="18"/>
                 <w:szCs w:val="18"/>
               </w:rPr>
-              <w:t xml:space="preserve">Revue, baseline locale et CI validées ; PR #178 ouverte, fusion à effectuer</w:t>
+              <w:t xml:space="preserve">Revue, baseline locale et CI validées ; PR de reprise à contrôler sur la branche, fusion à effectuer</w:t>
             </w:r>
           </w:p>
         </w:tc>

</xml_diff>

<commit_message>
docs: record actual L0 merges and correct delivery status
</commit_message>
<xml_diff>
--- a/docs/Plan_Implementations_Restantes_2026-10.docx
+++ b/docs/Plan_Implementations_Restantes_2026-10.docx
@@ -78,7 +78,7 @@
           <w:sz w:val="21"/>
           <w:szCs w:val="21"/>
         </w:rPr>
-        <w:t xml:space="preserve">Statut : L0 VALIDÉ LOCAL + CI, PR de reprise à contrôler sur la branche, fusion à effectuer ; L1–L11 PLANIFIÉS. Voir docs/suivi/LOT_L0.md et docs/REVUE_L0_2026-10.md. Aucun déploiement attesté par ce plan.</w:t>
+        <w:t xml:space="preserve">Statut : L0 LIVRÉ SUR MAIN, PR #178/#179 fusionnées, CI candidate verte ; L1–L11 PLANIFIÉS. Voir docs/suivi/LOT_L0.md et docs/REVUE_L0_2026-10.md. Aucun déploiement attesté par ce plan.</w:t>
       </w:r>
     </w:p>
     <w:p>
@@ -135,7 +135,7 @@
           <w:sz w:val="21"/>
           <w:szCs w:val="21"/>
         </w:rPr>
-        <w:t xml:space="preserve">Statut : L0 VALIDÉ LOCAL + CI, PR de reprise à contrôler sur la branche, fusion à effectuer ; L1–L11 PLANIFIÉS. Voir docs/suivi/LOT_L0.md et docs/REVUE_L0_2026-10.md. Aucun déploiement attesté par ce plan.</w:t>
+        <w:t xml:space="preserve">Statut : L0 LIVRÉ SUR MAIN, PR #178/#179 fusionnées, CI candidate verte ; L1–L11 PLANIFIÉS. Voir docs/suivi/LOT_L0.md et docs/REVUE_L0_2026-10.md. Aucun déploiement attesté par ce plan.</w:t>
       </w:r>
     </w:p>
     <w:p>
@@ -217,7 +217,7 @@
           <w:sz w:val="21"/>
           <w:szCs w:val="21"/>
         </w:rPr>
-        <w:t xml:space="preserve">Quatre corrections sont regroupées sur la branche L0 feat/l0-baseline-review : contrôle du statut/rôle à chaque requête protégée, remboursement WALLET entrant atomique, réconciliation PENDING/PROCESSING, réservation RDV concurrente sous verrou médecin. Résultats locaux du 6 octobre : 390 tests API + 50 tests web, 8 E2E, lint/typecheck et builds verts ; 29 migrations, schéma validé et aucune dérive constatée. Migration 28→29 répétée sur données synthétiques ; revue du diff consignée. CI candidate 6edcd427 verte (build-and-test et e2e), PR de reprise à contrôler sur la branche ; fournisseurs réels à valider séparément, aucune fusion/déploiement. Revérifier les checks de tête avant fusion.</w:t>
+        <w:t xml:space="preserve">Quatre corrections sont regroupées sur la branche L0 feat/l0-baseline-review : contrôle du statut/rôle à chaque requête protégée, remboursement WALLET entrant atomique, réconciliation PENDING/PROCESSING, réservation RDV concurrente sous verrou médecin. Résultats locaux du 6 octobre : 390 tests API + 50 tests web, 8 E2E, lint/typecheck et builds verts ; 29 migrations, schéma validé et aucune dérive constatée. Migration 28→29 répétée sur données synthétiques ; revue du diff consignée. CI candidates 6edcd427 et fd2114e vertes (build-and-test et e2e), PR #178/#179 fusionnées ; main vérifié à 2ee3cfb. Fournisseurs réels et déploiement à valider séparément ; consulter la CI main et la fiche L0.</w:t>
       </w:r>
     </w:p>
     <w:p>
@@ -1232,7 +1232,7 @@
                 <w:sz w:val="18"/>
                 <w:szCs w:val="18"/>
               </w:rPr>
-              <w:t xml:space="preserve">Revue, baseline locale et CI validées ; PR de reprise à contrôler sur la branche, fusion à effectuer</w:t>
+              <w:t xml:space="preserve">Revue et CI validées ; livré sur main par PR #178/#179</w:t>
             </w:r>
           </w:p>
         </w:tc>

</xml_diff>

<commit_message>
docs(dmp): record L1 review, closed migration and Claude Code guidance
</commit_message>
<xml_diff>
--- a/docs/Plan_Implementations_Restantes_2026-10.docx
+++ b/docs/Plan_Implementations_Restantes_2026-10.docx
@@ -78,7 +78,7 @@
           <w:sz w:val="21"/>
           <w:szCs w:val="21"/>
         </w:rPr>
-        <w:t xml:space="preserve">Statut : L0 LIVRÉ SUR MAIN, PR #178/#179 fusionnées, CI candidate verte ; L1–L11 PLANIFIÉS. Voir docs/suivi/LOT_L0.md et docs/REVUE_L0_2026-10.md. Aucun déploiement attesté par ce plan.</w:t>
+        <w:t xml:space="preserve">Statut : L0 LIVRÉ SUR MAIN, PR #178/#179 fusionnées, CI candidate verte ; L1 VALIDÉ LOCALEMENT (livraison/CI : PR du lot) ; L2–L11 PLANIFIÉS. Voir docs/suivi/LOT_L0.md et docs/REVUE_L0_2026-10.md. Aucun déploiement attesté par ce plan.</w:t>
       </w:r>
     </w:p>
     <w:p>
@@ -135,7 +135,7 @@
           <w:sz w:val="21"/>
           <w:szCs w:val="21"/>
         </w:rPr>
-        <w:t xml:space="preserve">Statut : L0 LIVRÉ SUR MAIN, PR #178/#179 fusionnées, CI candidate verte ; L1–L11 PLANIFIÉS. Voir docs/suivi/LOT_L0.md et docs/REVUE_L0_2026-10.md. Aucun déploiement attesté par ce plan.</w:t>
+        <w:t xml:space="preserve">Statut : L0 LIVRÉ SUR MAIN, PR #178/#179 fusionnées, CI candidate verte ; L1 VALIDÉ LOCALEMENT (livraison/CI : PR du lot) ; L2–L11 PLANIFIÉS. Voir docs/suivi/LOT_L0.md et docs/REVUE_L0_2026-10.md. Aucun déploiement attesté par ce plan.</w:t>
       </w:r>
     </w:p>
     <w:p>
@@ -1342,7 +1342,7 @@
                 <w:sz w:val="18"/>
                 <w:szCs w:val="18"/>
               </w:rPr>
-              <w:t xml:space="preserve">À implémenter</w:t>
+              <w:t xml:space="preserve">Validé localement ; livraison/CI dans LOT_L1 et PR du lot</w:t>
             </w:r>
           </w:p>
         </w:tc>
@@ -2580,6 +2580,19 @@
           <w:szCs w:val="21"/>
         </w:rPr>
         <w:t xml:space="preserve">Documentation. Invariants réels dans CLAUDE.md §4/§8 ; note de migration et matrice de droits ; addendum X1/X2 à l'audit et scénarios DMP de la recette sept rôles.</w:t>
+      </w:r>
+    </w:p>
+    <w:p>
+      <w:pPr>
+        <w:spacing w:after="110"/>
+      </w:pPr>
+      <w:r>
+        <w:rPr>
+          <w:rFonts w:ascii="Calibri" w:cs="Calibri" w:eastAsia="Calibri" w:hAnsi="Calibri"/>
+          <w:sz w:val="21"/>
+          <w:szCs w:val="21"/>
+        </w:rPr>
+        <w:t xml:space="preserve">Exécution L1 (6 octobre). Branche feat/l1-dmp-consent-authorship depuis main après #180. Auteur de session, échéance indépendante, contrôle export/pièces et transitions sérialisées. Migration additive : tous les anciens liens restent NULL jusqu’à une nouvelle réclamation ; aucune inférence d’auteur. 412 tests API + 50 web, 8 E2E et 11 étapes de release verts ; reprise 29→30 validée. Fiche docs/suivi/LOT_L1.md, revue docs/REVUE_L1_2026-10.md, addendum X1/X2 ; aucune fusion/déploiement déduit des modifications locales.</w:t>
       </w:r>
     </w:p>
     <w:p>

</xml_diff>

<commit_message>
docs(l2): record laboratory workflow review and migration evidence
</commit_message>
<xml_diff>
--- a/docs/Plan_Implementations_Restantes_2026-10.docx
+++ b/docs/Plan_Implementations_Restantes_2026-10.docx
@@ -78,7 +78,7 @@
           <w:sz w:val="21"/>
           <w:szCs w:val="21"/>
         </w:rPr>
-        <w:t xml:space="preserve">Statut : L0 LIVRÉ SUR MAIN, PR #178/#179 fusionnées, CI candidate verte ; L1 VALIDÉ LOCALEMENT (livraison/CI : PR du lot) ; L2–L11 PLANIFIÉS. Voir docs/suivi/LOT_L0.md et docs/REVUE_L0_2026-10.md. Aucun déploiement attesté par ce plan.</w:t>
+        <w:t xml:space="preserve">Statut : L0 LIVRÉ SUR MAIN, PR #178/#179 fusionnées, CI candidate verte ; L1 LIVRÉ SUR MAIN par PR #181 (53775be) ; L2 VALIDÉ LOCALEMENT (livraison/CI : PR du lot) ; L3–L11 PLANIFIÉS. Voir docs/suivi/LOT_L0.md et docs/REVUE_L0_2026-10.md. Aucun déploiement attesté par ce plan.</w:t>
       </w:r>
     </w:p>
     <w:p>
@@ -135,7 +135,7 @@
           <w:sz w:val="21"/>
           <w:szCs w:val="21"/>
         </w:rPr>
-        <w:t xml:space="preserve">Statut : L0 LIVRÉ SUR MAIN, PR #178/#179 fusionnées, CI candidate verte ; L1 VALIDÉ LOCALEMENT (livraison/CI : PR du lot) ; L2–L11 PLANIFIÉS. Voir docs/suivi/LOT_L0.md et docs/REVUE_L0_2026-10.md. Aucun déploiement attesté par ce plan.</w:t>
+        <w:t xml:space="preserve">Statut : L0 LIVRÉ SUR MAIN, PR #178/#179 fusionnées, CI candidate verte ; L1 LIVRÉ SUR MAIN par PR #181 (53775be) ; L2 VALIDÉ LOCALEMENT (livraison/CI : PR du lot) ; L3–L11 PLANIFIÉS. Voir docs/suivi/LOT_L0.md et docs/REVUE_L0_2026-10.md. Aucun déploiement attesté par ce plan.</w:t>
       </w:r>
     </w:p>
     <w:p>
@@ -1342,7 +1342,7 @@
                 <w:sz w:val="18"/>
                 <w:szCs w:val="18"/>
               </w:rPr>
-              <w:t xml:space="preserve">Validé localement ; livraison/CI dans LOT_L1 et PR du lot</w:t>
+              <w:t xml:space="preserve">Livré sur main par PR #181 ; preuves dans LOT_L1</w:t>
             </w:r>
           </w:p>
         </w:tc>
@@ -1452,7 +1452,7 @@
                 <w:sz w:val="18"/>
                 <w:szCs w:val="18"/>
               </w:rPr>
-              <w:t xml:space="preserve">À implémenter</w:t>
+              <w:t xml:space="preserve">Validé localement ; livraison/CI dans LOT_L2 et PR du lot</w:t>
             </w:r>
           </w:p>
         </w:tc>
@@ -2660,6 +2660,19 @@
           <w:szCs w:val="21"/>
         </w:rPr>
         <w:t xml:space="preserve">Documentation. Workflow KYC laboratoire, droits et reprise des comptes existants ; CLAUDE.md, playbook, addendum X3 et recette laboratoire.</w:t>
+      </w:r>
+    </w:p>
+    <w:p>
+      <w:pPr>
+        <w:spacing w:after="110"/>
+      </w:pPr>
+      <w:r>
+        <w:rPr>
+          <w:rFonts w:ascii="Calibri" w:cs="Calibri" w:eastAsia="Calibri" w:hAnsi="Calibri"/>
+          <w:sz w:val="21"/>
+          <w:szCs w:val="21"/>
+        </w:rPr>
+        <w:t xml:space="preserve">Implémentation L2. Branche feat/l2-laboratory-verification depuis main 53775be après #181. Structure et pièces obligatoires figées à soumission, badge après vérification manuelle, accès actif/approuvé, claim/avance/publication conditionnels. Les commandes suspendues restent attribuées ; lecture patient/médecin conservée, aucun transfert automatique. Migration 30→31 sans approbation héritée. Preuves, reprise, revue et statut de livraison : docs/suivi/LOT_L2.md, docs/REVUE_L2_2026-10.md, addendum X3. Les tests ne remplacent pas la recette humaine et les autorisations réelles.</w:t>
       </w:r>
     </w:p>
     <w:p>

</xml_diff>

<commit_message>
docs(l3): document replay contract review and migration evidence
</commit_message>
<xml_diff>
--- a/docs/Plan_Implementations_Restantes_2026-10.docx
+++ b/docs/Plan_Implementations_Restantes_2026-10.docx
@@ -78,7 +78,7 @@
           <w:sz w:val="21"/>
           <w:szCs w:val="21"/>
         </w:rPr>
-        <w:t xml:space="preserve">Statut : L0 LIVRÉ SUR MAIN, PR #178/#179 fusionnées, CI candidate verte ; L1 LIVRÉ SUR MAIN par PR #181 (53775be) ; L2 VALIDÉ LOCALEMENT (livraison/CI : PR du lot) ; L3–L11 PLANIFIÉS. Voir docs/suivi/LOT_L0.md et docs/REVUE_L0_2026-10.md. Aucun déploiement attesté par ce plan.</w:t>
+        <w:t xml:space="preserve">Statut : L0 LIVRÉ SUR MAIN, PR #178/#179 fusionnées, CI candidate verte ; L1 LIVRÉ SUR MAIN par PR #181 (53775be) ; L2 LIVRÉ SUR MAIN par PR #182 (eb1ba6e) ; L3 VALIDÉ LOCALEMENT (preuves/CI : LOT_L3 et PR du lot) ; L4–L11 PLANIFIÉS. Voir docs/suivi/LOT_L0.md et docs/REVUE_L0_2026-10.md. Aucun déploiement attesté par ce plan.</w:t>
       </w:r>
     </w:p>
     <w:p>
@@ -135,7 +135,7 @@
           <w:sz w:val="21"/>
           <w:szCs w:val="21"/>
         </w:rPr>
-        <w:t xml:space="preserve">Statut : L0 LIVRÉ SUR MAIN, PR #178/#179 fusionnées, CI candidate verte ; L1 LIVRÉ SUR MAIN par PR #181 (53775be) ; L2 VALIDÉ LOCALEMENT (livraison/CI : PR du lot) ; L3–L11 PLANIFIÉS. Voir docs/suivi/LOT_L0.md et docs/REVUE_L0_2026-10.md. Aucun déploiement attesté par ce plan.</w:t>
+        <w:t xml:space="preserve">Statut : L0 LIVRÉ SUR MAIN, PR #178/#179 fusionnées, CI candidate verte ; L1 LIVRÉ SUR MAIN par PR #181 (53775be) ; L2 LIVRÉ SUR MAIN par PR #182 (eb1ba6e) ; L3 VALIDÉ LOCALEMENT (preuves/CI : LOT_L3 et PR du lot) ; L4–L11 PLANIFIÉS. Voir docs/suivi/LOT_L0.md et docs/REVUE_L0_2026-10.md. Aucun déploiement attesté par ce plan.</w:t>
       </w:r>
     </w:p>
     <w:p>
@@ -1452,7 +1452,7 @@
                 <w:sz w:val="18"/>
                 <w:szCs w:val="18"/>
               </w:rPr>
-              <w:t xml:space="preserve">Validé localement ; livraison/CI dans LOT_L2 et PR du lot</w:t>
+              <w:t xml:space="preserve">Livré sur main par PR #182 ; preuves dans LOT_L2</w:t>
             </w:r>
           </w:p>
         </w:tc>
@@ -1562,7 +1562,7 @@
                 <w:sz w:val="18"/>
                 <w:szCs w:val="18"/>
               </w:rPr>
-              <w:t xml:space="preserve">À implémenter</w:t>
+              <w:t xml:space="preserve">Validé localement ; preuves et livraison dans LOT_L3</w:t>
             </w:r>
           </w:p>
         </w:tc>
@@ -2740,6 +2740,19 @@
           <w:szCs w:val="21"/>
         </w:rPr>
         <w:t xml:space="preserve">Documentation. Contrat Idempotency-Key, routes couvertes et exclusions, TTL, codes d'erreur, comportement de reprise ; nouveau piège dans CLAUDE.md §8 et recette coupure réseau.</w:t>
+      </w:r>
+    </w:p>
+    <w:p>
+      <w:pPr>
+        <w:spacing w:after="110"/>
+      </w:pPr>
+      <w:r>
+        <w:rPr>
+          <w:rFonts w:ascii="Calibri" w:cs="Calibri" w:eastAsia="Calibri" w:hAnsi="Calibri"/>
+          <w:sz w:val="21"/>
+          <w:szCs w:val="21"/>
+        </w:rPr>
+        <w:t xml:space="preserve">Implémentation L3. Branche feat/l3-idempotent-sync depuis main eb1ba6e après #182. Huit routes positives partagées, clé avant fetch, effet/reçu AES-GCM dans une transaction sous verrou User, contrôles courants et HMAC du contenu. Âge 7 j, reçus 14 j, purge 03:10 ; 401 arrête la file, anciens envois ambigus conservés pour revue. Exclusions financières/auth/SOS/consentements, fermeture de grossesse à cible mouvante en ligne. Contrat/revue/preuves : docs/CONTRAT_Synchronisation_L3.md, docs/REVUE_L3_2026-10.md, docs/suivi/LOT_L3.md. 460 API +64 web +11 E2E verts ; release:check 11 étapes, reprise 31→32 sans altération historique. Chiffrement des corps locaux et UX de reprise restent L4.</w:t>
       </w:r>
     </w:p>
     <w:p>

</xml_diff>

<commit_message>
docs: record L4 vault policy, review and remaining implementation plan
</commit_message>
<xml_diff>
--- a/docs/Plan_Implementations_Restantes_2026-10.docx
+++ b/docs/Plan_Implementations_Restantes_2026-10.docx
@@ -78,7 +78,7 @@
           <w:sz w:val="21"/>
           <w:szCs w:val="21"/>
         </w:rPr>
-        <w:t xml:space="preserve">Statut : L0 LIVRÉ SUR MAIN, PR #178/#179 fusionnées, CI candidate verte ; L1 LIVRÉ SUR MAIN par PR #181 (53775be) ; L2 LIVRÉ SUR MAIN par PR #182 (eb1ba6e) ; L3 VALIDÉ LOCALEMENT (preuves/CI : LOT_L3 et PR du lot) ; L4–L11 PLANIFIÉS. Voir docs/suivi/LOT_L0.md et docs/REVUE_L0_2026-10.md. Aucun déploiement attesté par ce plan.</w:t>
+        <w:t xml:space="preserve">Statut : L0 LIVRÉ SUR MAIN, PR #178/#179 fusionnées, CI candidate verte ; L1 LIVRÉ SUR MAIN par PR #181 (53775be) ; L2 LIVRÉ SUR MAIN par PR #182 (eb1ba6e) ; L3 LIVRÉ SUR MAIN par PR #183 (ce1cae8) ; L4 VALIDÉ LOCALEMENT (preuves/CI : LOT_L4 et PR du lot) ; L5–L11 PLANIFIÉS. Mise à jour : 7 octobre 2026. Voir docs/suivi/LOT_L0.md et docs/REVUE_L0_2026-10.md. Aucun déploiement attesté par ce plan.</w:t>
       </w:r>
     </w:p>
     <w:p>
@@ -135,7 +135,7 @@
           <w:sz w:val="21"/>
           <w:szCs w:val="21"/>
         </w:rPr>
-        <w:t xml:space="preserve">Statut : L0 LIVRÉ SUR MAIN, PR #178/#179 fusionnées, CI candidate verte ; L1 LIVRÉ SUR MAIN par PR #181 (53775be) ; L2 LIVRÉ SUR MAIN par PR #182 (eb1ba6e) ; L3 VALIDÉ LOCALEMENT (preuves/CI : LOT_L3 et PR du lot) ; L4–L11 PLANIFIÉS. Voir docs/suivi/LOT_L0.md et docs/REVUE_L0_2026-10.md. Aucun déploiement attesté par ce plan.</w:t>
+        <w:t xml:space="preserve">Statut : L0 LIVRÉ SUR MAIN, PR #178/#179 fusionnées, CI candidate verte ; L1 LIVRÉ SUR MAIN par PR #181 (53775be) ; L2 LIVRÉ SUR MAIN par PR #182 (eb1ba6e) ; L3 LIVRÉ SUR MAIN par PR #183 (ce1cae8) ; L4 VALIDÉ LOCALEMENT (preuves/CI : LOT_L4 et PR du lot) ; L5–L11 PLANIFIÉS. Mise à jour : 7 octobre 2026. Voir docs/suivi/LOT_L0.md et docs/REVUE_L0_2026-10.md. Aucun déploiement attesté par ce plan.</w:t>
       </w:r>
     </w:p>
     <w:p>
@@ -1562,7 +1562,7 @@
                 <w:sz w:val="18"/>
                 <w:szCs w:val="18"/>
               </w:rPr>
-              <w:t xml:space="preserve">Validé localement ; preuves et livraison dans LOT_L3</w:t>
+              <w:t xml:space="preserve">Livré sur main par PR #183 ; preuves dans LOT_L3</w:t>
             </w:r>
           </w:p>
         </w:tc>
@@ -1672,7 +1672,7 @@
                 <w:sz w:val="18"/>
                 <w:szCs w:val="18"/>
               </w:rPr>
-              <w:t xml:space="preserve">À implémenter</w:t>
+              <w:t xml:space="preserve">Candidate sur feat/l4-protected-offline ; preuves dans LOT_L4</w:t>
             </w:r>
           </w:p>
         </w:tc>
@@ -2833,6 +2833,19 @@
           <w:szCs w:val="21"/>
         </w:rPr>
         <w:t xml:space="preserve">Documentation. Politique locale et limites de révocation sans réseau, modèle de protection, matrice « disponible hors ligne » ; CLAUDE.md, playbook et recette Android/iOS.</w:t>
+      </w:r>
+    </w:p>
+    <w:p>
+      <w:pPr>
+        <w:spacing w:after="110"/>
+      </w:pPr>
+      <w:r>
+        <w:rPr>
+          <w:rFonts w:ascii="Calibri" w:cs="Calibri" w:eastAsia="Calibri" w:hAnsi="Calibri"/>
+          <w:sz w:val="21"/>
+          <w:szCs w:val="21"/>
+        </w:rPr>
+        <w:t xml:space="preserve">Implémentation L4 (7 octobre). Base main ce1cae8 après fusion #183. Coffre opt-in à phrase locale, PBKDF2/AES-GCM et clé ouverte en mémoire ; lectures minimales explicitement synchronisées, datées, avertissement 6 h/expiration 24 h. Files scellées, lock/reload/purge atomique, isolation des comptes et migration conservatrice v3→v4. Sans coffre : premier envoi en ligne avec ticket minimal, reprise GET reçu seule ; résultat non confirmé bloque toute nouvelle mutation couverte jusqu’à revue. UI Wax &amp; Terre et reprise manuelle, SW limité aux coquilles/chunks publics, promesses SOS corrigées. Contrat : docs/CONTRAT_Hors_Ligne_L4.md, revue : docs/REVUE_L4_2026-10.md, livraison/preuves : docs/suivi/LOT_L4.md. 167 REST/1 WS, 67 pages, 32 migrations ; 467 API +103 web +15 E2E et 11 contrôles release verts, aucun skip ; plan DOCX régénéré et validé structurellement. L’héritage non déverrouillé reste en clair et averti jusqu’à migration de chaque compte/effacement explicite après vérification ; aucune promesse anti-XSS ni révocation hors réseau. Recette Android/iOS et validation clinique/native non attestées.</w:t>
       </w:r>
     </w:p>
     <w:p>

</xml_diff>

<commit_message>
docs(claude): document L5 private Daily contract, review and validation
</commit_message>
<xml_diff>
--- a/docs/Plan_Implementations_Restantes_2026-10.docx
+++ b/docs/Plan_Implementations_Restantes_2026-10.docx
@@ -78,7 +78,7 @@
           <w:sz w:val="21"/>
           <w:szCs w:val="21"/>
         </w:rPr>
-        <w:t xml:space="preserve">Statut : L0 LIVRÉ SUR MAIN, PR #178/#179 fusionnées, CI candidate verte ; L1 LIVRÉ SUR MAIN par PR #181 (53775be) ; L2 LIVRÉ SUR MAIN par PR #182 (eb1ba6e) ; L3 LIVRÉ SUR MAIN par PR #183 (ce1cae8) ; L4 VALIDÉ LOCALEMENT (preuves/CI : LOT_L4 et PR du lot) ; L5–L11 PLANIFIÉS. Mise à jour : 7 octobre 2026. Voir docs/suivi/LOT_L0.md et docs/REVUE_L0_2026-10.md. Aucun déploiement attesté par ce plan.</w:t>
+        <w:t xml:space="preserve">Statut : L0 LIVRÉ SUR MAIN, PR #178/#179 fusionnées, CI candidate verte ; L1 LIVRÉ SUR MAIN par PR #181 (53775be) ; L2 LIVRÉ SUR MAIN par PR #182 (eb1ba6e) ; L3 LIVRÉ SUR MAIN par PR #183 (ce1cae8) ; L4 LIVRÉ SUR MAIN par PR #184 (0d3cb74) ; L5 CANDIDATE VALIDÉE LOCALEMENT (preuves/CI : LOT_L5 et PR du lot) ; L6–L11 PLANIFIÉS. Mise à jour : 7 octobre 2026. Voir docs/suivi/LOT_L0.md et docs/REVUE_L0_2026-10.md. Aucun déploiement attesté par ce plan.</w:t>
       </w:r>
     </w:p>
     <w:p>
@@ -135,7 +135,7 @@
           <w:sz w:val="21"/>
           <w:szCs w:val="21"/>
         </w:rPr>
-        <w:t xml:space="preserve">Statut : L0 LIVRÉ SUR MAIN, PR #178/#179 fusionnées, CI candidate verte ; L1 LIVRÉ SUR MAIN par PR #181 (53775be) ; L2 LIVRÉ SUR MAIN par PR #182 (eb1ba6e) ; L3 LIVRÉ SUR MAIN par PR #183 (ce1cae8) ; L4 VALIDÉ LOCALEMENT (preuves/CI : LOT_L4 et PR du lot) ; L5–L11 PLANIFIÉS. Mise à jour : 7 octobre 2026. Voir docs/suivi/LOT_L0.md et docs/REVUE_L0_2026-10.md. Aucun déploiement attesté par ce plan.</w:t>
+        <w:t xml:space="preserve">Statut : L0 LIVRÉ SUR MAIN, PR #178/#179 fusionnées, CI candidate verte ; L1 LIVRÉ SUR MAIN par PR #181 (53775be) ; L2 LIVRÉ SUR MAIN par PR #182 (eb1ba6e) ; L3 LIVRÉ SUR MAIN par PR #183 (ce1cae8) ; L4 LIVRÉ SUR MAIN par PR #184 (0d3cb74) ; L5 CANDIDATE VALIDÉE LOCALEMENT (preuves/CI : LOT_L5 et PR du lot) ; L6–L11 PLANIFIÉS. Mise à jour : 7 octobre 2026. Voir docs/suivi/LOT_L0.md et docs/REVUE_L0_2026-10.md. Aucun déploiement attesté par ce plan.</w:t>
       </w:r>
     </w:p>
     <w:p>
@@ -1672,7 +1672,7 @@
                 <w:sz w:val="18"/>
                 <w:szCs w:val="18"/>
               </w:rPr>
-              <w:t xml:space="preserve">Candidate sur feat/l4-protected-offline ; preuves dans LOT_L4</w:t>
+              <w:t xml:space="preserve">Livré sur main par PR #184 ; preuves dans LOT_L4</w:t>
             </w:r>
           </w:p>
         </w:tc>
@@ -1782,7 +1782,7 @@
                 <w:sz w:val="18"/>
                 <w:szCs w:val="18"/>
               </w:rPr>
-              <w:t xml:space="preserve">À implémenter</w:t>
+              <w:t xml:space="preserve">Candidate sur feat/l5-private-teleconsultation ; recette réelle en L10</w:t>
             </w:r>
           </w:p>
         </w:tc>
@@ -2861,6 +2861,19 @@
           <w:szCs w:val="21"/>
         </w:rPr>
         <w:t xml:space="preserve">L5 — Téléconsultation Daily privée</w:t>
+      </w:r>
+    </w:p>
+    <w:p>
+      <w:pPr>
+        <w:spacing w:after="110"/>
+      </w:pPr>
+      <w:r>
+        <w:rPr>
+          <w:rFonts w:ascii="Calibri" w:cs="Calibri" w:eastAsia="Calibri" w:hAnsi="Calibri"/>
+          <w:sz w:val="21"/>
+          <w:szCs w:val="21"/>
+        </w:rPr>
+        <w:t xml:space="preserve">Reprise du 7 octobre. Candidate implémentée/revue depuis main après #184 ; preuves suivi/LOT_L5.md, contrat et auto-revue L5. SDK officiel 0.93.0 (load sans token avant join sur instance chargée), jeton mémoire hors URL, salle privée relue, droits actuels et échéances bornées, coupure réelle AUDIO, CHAT/sortie et surveillance. Sans Daily : absence explicite de média, aucun iframe/token fictif. Les tests contractuels/UI sans fournisseur ne valident pas l'appel réel deux appareils, repris en L10 avant GO L11. PR/CI et livraison restent à vérifier sur le commit final.</w:t>
       </w:r>
     </w:p>
     <w:p>
@@ -3977,7 +3990,7 @@
                 <w:sz w:val="18"/>
                 <w:szCs w:val="18"/>
               </w:rPr>
-              <w:t xml:space="preserve">Utilise les jetons Daily dans des salles privées et rends la dégradation du média effective.</w:t>
+              <w:t xml:space="preserve">Charge Daily sans token puis joins sur la même instance chargée ; contrôle accès privé/échéances et coupe réellement le média en dégradation.</w:t>
             </w:r>
           </w:p>
         </w:tc>
@@ -4600,7 +4613,7 @@
           <w:sz w:val="21"/>
           <w:szCs w:val="21"/>
         </w:rPr>
-        <w:t xml:space="preserve">CLAUDE.md, playbook, CDC et documentation technique ; audit de sécurité de release septembre (X1–X15), état des lieux septembre, GO/NO-GO du 22 septembre, recette sept rôles, suivis B1–B5 et fiches fournisseurs. Constats vérifiés dans subscriptions.routes.ts, pro/stats/page.tsx, dmp-consent.ts, queue.ts/client.ts, sw.js/useApi.ts et ConsultationRoom.tsx. Nouveau constat de protection locale : queue.ts conserve actuellement les corps de mutation dans IndexedDB sans chiffrement explicite ; à traiter avec L4, pas à présenter comme déjà résolu.</w:t>
+        <w:t xml:space="preserve">CLAUDE.md, playbook, CDC et documentation technique ; audit de sécurité de release septembre (X1–X15), état des lieux septembre, GO/NO-GO du 22 septembre, recette sept rôles, suivis B1–B5 et fiches fournisseurs. Constats vérifiés dans subscriptions.routes.ts, pro/stats/page.tsx, dmp-consent.ts, queue.ts/client.ts, sw.js/useApi.ts et ConsultationRoom.tsx. Constat initial de protection locale traité par L4 : nouveaux corps chiffrés sous coffre ouvert, tickets sans corps hors coffre ; héritage non migré encore en clair et signalé, recette appareils requise. Lire le contrat L4 avant toute promesse de protection complète.</w:t>
       </w:r>
     </w:p>
     <w:sectPr>

</xml_diff>

<commit_message>
docs(subscriptions): record L6 contracts, review and validation evidence
</commit_message>
<xml_diff>
--- a/docs/Plan_Implementations_Restantes_2026-10.docx
+++ b/docs/Plan_Implementations_Restantes_2026-10.docx
@@ -78,7 +78,7 @@
           <w:sz w:val="21"/>
           <w:szCs w:val="21"/>
         </w:rPr>
-        <w:t xml:space="preserve">Statut : L0 LIVRÉ SUR MAIN, PR #178/#179 fusionnées, CI candidate verte ; L1 LIVRÉ SUR MAIN par PR #181 (53775be) ; L2 LIVRÉ SUR MAIN par PR #182 (eb1ba6e) ; L3 LIVRÉ SUR MAIN par PR #183 (ce1cae8) ; L4 LIVRÉ SUR MAIN par PR #184 (0d3cb74) ; L5 CANDIDATE VALIDÉE LOCALEMENT (preuves/CI : LOT_L5 et PR du lot) ; L6–L11 PLANIFIÉS. Mise à jour : 7 octobre 2026. Voir docs/suivi/LOT_L0.md et docs/REVUE_L0_2026-10.md. Aucun déploiement attesté par ce plan.</w:t>
+        <w:t xml:space="preserve">Statut : L0 LIVRÉ SUR MAIN, PR #178/#179 fusionnées, CI candidate verte ; L1 LIVRÉ SUR MAIN par PR #181 (53775be) ; L2 LIVRÉ SUR MAIN par PR #182 (eb1ba6e) ; L3 LIVRÉ SUR MAIN par PR #183 (ce1cae8) ; L4 LIVRÉ SUR MAIN par PR #184 (0d3cb74) ; L5 LIVRÉ SUR MAIN par PR #185 (2e5cc77) ; L6 CANDIDATE VALIDÉE LOCALEMENT (preuves/CI : LOT_L6 et PR du lot) ; L7–L11 OUVERTS. Mise à jour : 7 octobre 2026. Voir docs/suivi/LOT_L0.md et docs/REVUE_L0_2026-10.md. Aucun déploiement attesté par ce plan.</w:t>
       </w:r>
     </w:p>
     <w:p>
@@ -135,7 +135,7 @@
           <w:sz w:val="21"/>
           <w:szCs w:val="21"/>
         </w:rPr>
-        <w:t xml:space="preserve">Statut : L0 LIVRÉ SUR MAIN, PR #178/#179 fusionnées, CI candidate verte ; L1 LIVRÉ SUR MAIN par PR #181 (53775be) ; L2 LIVRÉ SUR MAIN par PR #182 (eb1ba6e) ; L3 LIVRÉ SUR MAIN par PR #183 (ce1cae8) ; L4 LIVRÉ SUR MAIN par PR #184 (0d3cb74) ; L5 CANDIDATE VALIDÉE LOCALEMENT (preuves/CI : LOT_L5 et PR du lot) ; L6–L11 PLANIFIÉS. Mise à jour : 7 octobre 2026. Voir docs/suivi/LOT_L0.md et docs/REVUE_L0_2026-10.md. Aucun déploiement attesté par ce plan.</w:t>
+        <w:t xml:space="preserve">Statut : L0 LIVRÉ SUR MAIN, PR #178/#179 fusionnées, CI candidate verte ; L1 LIVRÉ SUR MAIN par PR #181 (53775be) ; L2 LIVRÉ SUR MAIN par PR #182 (eb1ba6e) ; L3 LIVRÉ SUR MAIN par PR #183 (ce1cae8) ; L4 LIVRÉ SUR MAIN par PR #184 (0d3cb74) ; L5 LIVRÉ SUR MAIN par PR #185 (2e5cc77) ; L6 CANDIDATE VALIDÉE LOCALEMENT (preuves/CI : LOT_L6 et PR du lot) ; L7–L11 OUVERTS. Mise à jour : 7 octobre 2026. Voir docs/suivi/LOT_L0.md et docs/REVUE_L0_2026-10.md. Aucun déploiement attesté par ce plan.</w:t>
       </w:r>
     </w:p>
     <w:p>
@@ -667,7 +667,7 @@
                 <w:sz w:val="18"/>
                 <w:szCs w:val="18"/>
               </w:rPr>
-              <w:t xml:space="preserve">Catalogue serveur versionné ; paiement d'une période, sans renouvellement automatique non pris en charge par le fournisseur. Aucun tarif inventé.</w:t>
+              <w:t xml:space="preserve">Approuvé par le porteur le 7 octobre : FREE + PRO 5 000 XOF/mois calendaire Africa/Lagos, renouvellement manuel ; STARTER/CLINIC désactivés. PRO réserve nouveau démarrage téléconsultation et revenus L7 ; FREE conserve base/soins ouverts. Aucun débit récurrent.</w:t>
             </w:r>
           </w:p>
         </w:tc>
@@ -1782,7 +1782,7 @@
                 <w:sz w:val="18"/>
                 <w:szCs w:val="18"/>
               </w:rPr>
-              <w:t xml:space="preserve">Candidate sur feat/l5-private-teleconsultation ; recette réelle en L10</w:t>
+              <w:t xml:space="preserve">Livré sur main par PR #185 ; recette réelle en L10</w:t>
             </w:r>
           </w:p>
         </w:tc>
@@ -1866,7 +1866,7 @@
                 <w:sz w:val="18"/>
                 <w:szCs w:val="18"/>
               </w:rPr>
-              <w:t xml:space="preserve">L0, décisions commerciales</w:t>
+              <w:t xml:space="preserve">L0, décisions commerciales approuvées</w:t>
             </w:r>
           </w:p>
         </w:tc>
@@ -1892,7 +1892,7 @@
                 <w:sz w:val="18"/>
                 <w:szCs w:val="18"/>
               </w:rPr>
-              <w:t xml:space="preserve">À implémenter</w:t>
+              <w:t xml:space="preserve">Candidate sur feat/l6-paid-doctor-subscriptions ; preuves LOT_L6</w:t>
             </w:r>
           </w:p>
         </w:tc>
@@ -2873,7 +2873,7 @@
           <w:sz w:val="21"/>
           <w:szCs w:val="21"/>
         </w:rPr>
-        <w:t xml:space="preserve">Reprise du 7 octobre. Candidate implémentée/revue depuis main après #184 ; preuves suivi/LOT_L5.md, contrat et auto-revue L5. SDK officiel 0.93.0 (load sans token avant join sur instance chargée), jeton mémoire hors URL, salle privée relue, droits actuels et échéances bornées, coupure réelle AUDIO, CHAT/sortie et surveillance. Sans Daily : absence explicite de média, aucun iframe/token fictif. Les tests contractuels/UI sans fournisseur ne valident pas l'appel réel deux appareils, repris en L10 avant GO L11. PR/CI et livraison restent à vérifier sur le commit final.</w:t>
+        <w:t xml:space="preserve">Reprise du 7 octobre. Livré sur main par PR #185 (2e5cc77), fusion le 7 octobre à 12:42:54 UTC, CI main 37623001929 verte ; implémentation/revue depuis main après #184 ; preuves suivi/LOT_L5.md, contrat et auto-revue L5. SDK officiel 0.93.0 (load sans token avant join sur instance chargée), jeton mémoire hors URL, salle privée relue, droits actuels et échéances bornées, coupure réelle AUDIO, CHAT/sortie et surveillance. Sans Daily : absence explicite de média, aucun iframe/token fictif. Les tests contractuels/UI sans fournisseur ne valident pas l'appel réel deux appareils, repris en L10 avant GO L11. Preuves de livraison dans LOT_L5 ; aucune recette média réelle ou mise en production attestée.</w:t>
       </w:r>
     </w:p>
     <w:p>
@@ -2941,6 +2941,19 @@
           <w:szCs w:val="21"/>
         </w:rPr>
         <w:t xml:space="preserve">L6 — Abonnements réellement payants</w:t>
+      </w:r>
+    </w:p>
+    <w:p>
+      <w:pPr>
+        <w:spacing w:after="110"/>
+      </w:pPr>
+      <w:r>
+        <w:rPr>
+          <w:rFonts w:ascii="Calibri" w:cs="Calibri" w:eastAsia="Calibri" w:hAnsi="Calibri"/>
+          <w:sz w:val="21"/>
+          <w:szCs w:val="21"/>
+        </w:rPr>
+        <w:t xml:space="preserve">Reprise du 7 octobre. Candidate implémentée selon les choix commerciaux approuvés, depuis main après #185. Catalogue FREE/PRO 5 000 XOF/mois calendaire, UUID stable, paiement/activation/audit transactionnels, renouvellement manuel, expiration au contrôle courant, arrêt à échéance et abandon sans activation tardive. Nouvelle téléconsultation réservée PRO ; accès aux soins ouverts conservé. Migration additive 33 ferme les plans historiques non prouvés sans inventer de paiement. Contrat, recette, suivi/revue L6 : CONTRAT_Abonnements_L6.md, RECETTE_Abonnements_L6.md, suivi/LOT_L6.md, REVUE_L6_2026-10.md. Re-tests §5 ; fournisseurs réels L10, revenus L7. Preuves locales : 534 API +117 web et 21 E2E verts, release:check 11 étapes, migration sans dérive ; commit applicatif ca90ce0e. Livraison/CI finales à vérifier sur la PR L6.</w:t>
       </w:r>
     </w:p>
     <w:p>

</xml_diff>

<commit_message>
docs(claude): document L7 finance rules and review evidence
</commit_message>
<xml_diff>
--- a/docs/Plan_Implementations_Restantes_2026-10.docx
+++ b/docs/Plan_Implementations_Restantes_2026-10.docx
@@ -78,7 +78,7 @@
           <w:sz w:val="21"/>
           <w:szCs w:val="21"/>
         </w:rPr>
-        <w:t xml:space="preserve">Statut : L0 LIVRÉ SUR MAIN, PR #178/#179 fusionnées, CI candidate verte ; L1 LIVRÉ SUR MAIN par PR #181 (53775be) ; L2 LIVRÉ SUR MAIN par PR #182 (eb1ba6e) ; L3 LIVRÉ SUR MAIN par PR #183 (ce1cae8) ; L4 LIVRÉ SUR MAIN par PR #184 (0d3cb74) ; L5 LIVRÉ SUR MAIN par PR #185 (2e5cc77) ; L6 CANDIDATE VALIDÉE LOCALEMENT (preuves/CI : LOT_L6 et PR du lot) ; L7–L11 OUVERTS. Mise à jour : 7 octobre 2026. Voir docs/suivi/LOT_L0.md et docs/REVUE_L0_2026-10.md. Aucun déploiement attesté par ce plan.</w:t>
+        <w:t xml:space="preserve">Statut : L0 LIVRÉ SUR MAIN, PR #178/#179 fusionnées, CI candidate verte ; L1 LIVRÉ SUR MAIN par PR #181 (53775be) ; L2 LIVRÉ SUR MAIN par PR #182 (eb1ba6e) ; L3 LIVRÉ SUR MAIN par PR #183 (ce1cae8) ; L4 LIVRÉ SUR MAIN par PR #184 (0d3cb74) ; L5 LIVRÉ SUR MAIN par PR #185 (2e5cc77) ; L6 LIVRÉ SUR MAIN par PR #186 (91a0fc9) ; L7 CANDIDATE (preuves/revue/PR : LOT_L7) ; L8–L11 OUVERTS. Mise à jour : 7 octobre 2026. Voir docs/suivi/LOT_L0.md et docs/REVUE_L0_2026-10.md. Aucun déploiement attesté par ce plan.</w:t>
       </w:r>
     </w:p>
     <w:p>
@@ -135,7 +135,7 @@
           <w:sz w:val="21"/>
           <w:szCs w:val="21"/>
         </w:rPr>
-        <w:t xml:space="preserve">Statut : L0 LIVRÉ SUR MAIN, PR #178/#179 fusionnées, CI candidate verte ; L1 LIVRÉ SUR MAIN par PR #181 (53775be) ; L2 LIVRÉ SUR MAIN par PR #182 (eb1ba6e) ; L3 LIVRÉ SUR MAIN par PR #183 (ce1cae8) ; L4 LIVRÉ SUR MAIN par PR #184 (0d3cb74) ; L5 LIVRÉ SUR MAIN par PR #185 (2e5cc77) ; L6 CANDIDATE VALIDÉE LOCALEMENT (preuves/CI : LOT_L6 et PR du lot) ; L7–L11 OUVERTS. Mise à jour : 7 octobre 2026. Voir docs/suivi/LOT_L0.md et docs/REVUE_L0_2026-10.md. Aucun déploiement attesté par ce plan.</w:t>
+        <w:t xml:space="preserve">Statut : L0 LIVRÉ SUR MAIN, PR #178/#179 fusionnées, CI candidate verte ; L1 LIVRÉ SUR MAIN par PR #181 (53775be) ; L2 LIVRÉ SUR MAIN par PR #182 (eb1ba6e) ; L3 LIVRÉ SUR MAIN par PR #183 (ce1cae8) ; L4 LIVRÉ SUR MAIN par PR #184 (0d3cb74) ; L5 LIVRÉ SUR MAIN par PR #185 (2e5cc77) ; L6 LIVRÉ SUR MAIN par PR #186 (91a0fc9) ; L7 CANDIDATE (preuves/revue/PR : LOT_L7) ; L8–L11 OUVERTS. Mise à jour : 7 octobre 2026. Voir docs/suivi/LOT_L0.md et docs/REVUE_L0_2026-10.md. Aucun déploiement attesté par ce plan.</w:t>
       </w:r>
     </w:p>
     <w:p>
@@ -751,7 +751,7 @@
                 <w:sz w:val="18"/>
                 <w:szCs w:val="18"/>
               </w:rPr>
-              <w:t xml:space="preserve">Circuit manuel traçable pour le pilote ; automatisation séparée si contrat/API fournisseur vérifiés.</w:t>
+              <w:t xml:space="preserve">Circuit manuel traçable pour le pilote ; automatisation séparée si contrat/API fournisseur vérifiés. CSV et reçu non fiscal approuvés le 7 octobre ; facture fiscale hors pilote.</w:t>
             </w:r>
           </w:p>
         </w:tc>
@@ -1892,7 +1892,7 @@
                 <w:sz w:val="18"/>
                 <w:szCs w:val="18"/>
               </w:rPr>
-              <w:t xml:space="preserve">Candidate sur feat/l6-paid-doctor-subscriptions ; preuves LOT_L6</w:t>
+              <w:t xml:space="preserve">Livré sur main par PR #186 ; preuves LOT_L6</w:t>
             </w:r>
           </w:p>
         </w:tc>
@@ -1976,7 +1976,7 @@
                 <w:sz w:val="18"/>
                 <w:szCs w:val="18"/>
               </w:rPr>
-              <w:t xml:space="preserve">L6 pour revenus d'abonnement ; L0 pour consultations</w:t>
+              <w:t xml:space="preserve">L6 pour accès PRO aux statistiques ; L0 pour consultations</w:t>
             </w:r>
           </w:p>
         </w:tc>
@@ -2002,7 +2002,7 @@
                 <w:sz w:val="18"/>
                 <w:szCs w:val="18"/>
               </w:rPr>
-              <w:t xml:space="preserve">À implémenter</w:t>
+              <w:t xml:space="preserve">Candidate feat/l7-revenues-finance-operations ; preuves LOT_L7</w:t>
             </w:r>
           </w:p>
         </w:tc>
@@ -2953,7 +2953,7 @@
           <w:sz w:val="21"/>
           <w:szCs w:val="21"/>
         </w:rPr>
-        <w:t xml:space="preserve">Reprise du 7 octobre. Candidate implémentée selon les choix commerciaux approuvés, depuis main après #185. Catalogue FREE/PRO 5 000 XOF/mois calendaire, UUID stable, paiement/activation/audit transactionnels, renouvellement manuel, expiration au contrôle courant, arrêt à échéance et abandon sans activation tardive. Nouvelle téléconsultation réservée PRO ; accès aux soins ouverts conservé. Migration additive 33 ferme les plans historiques non prouvés sans inventer de paiement. Contrat, recette, suivi/revue L6 : CONTRAT_Abonnements_L6.md, RECETTE_Abonnements_L6.md, suivi/LOT_L6.md, REVUE_L6_2026-10.md. Re-tests §5 ; fournisseurs réels L10, revenus L7. Preuves locales : 534 API +117 web et 21 E2E verts, release:check 11 étapes, migration sans dérive ; commit applicatif ca90ce0e. Livraison/CI finales à vérifier sur la PR L6.</w:t>
+        <w:t xml:space="preserve">Reprise du 7 octobre. Livré sur main par PR #186 (91a0fc9), fusion à 14:51:11 Africa/Lagos, CI main 37631822824 verte ; implémenté selon les choix commerciaux approuvés depuis main après #185. Catalogue FREE/PRO 5 000 XOF/mois calendaire, UUID stable, paiement/activation/audit transactionnels, renouvellement manuel, expiration au contrôle courant, arrêt à échéance et abandon sans activation tardive. Nouvelle téléconsultation réservée PRO ; accès aux soins ouverts conservé. Migration additive 33 ferme les plans historiques non prouvés sans inventer de paiement. Contrat, recette, suivi/revue L6 : CONTRAT_Abonnements_L6.md, RECETTE_Abonnements_L6.md, suivi/LOT_L6.md, REVUE_L6_2026-10.md. Re-tests §5 ; fournisseurs réels L10, revenus L7. Preuves locales : 534 API +117 web et 21 E2E verts, release:check 11 étapes, migration sans dérive ; commit applicatif ca90ce0e. CI PR finale 37629254298 verte sur 3fb0969 ; preuves LOT_L6.</w:t>
       </w:r>
     </w:p>
     <w:p>
@@ -3021,6 +3021,19 @@
           <w:szCs w:val="21"/>
         </w:rPr>
         <w:t xml:space="preserve">L7 — Revenus, exports et opérations financières</w:t>
+      </w:r>
+    </w:p>
+    <w:p>
+      <w:pPr>
+        <w:spacing w:after="110"/>
+      </w:pPr>
+      <w:r>
+        <w:rPr>
+          <w:rFonts w:ascii="Calibri" w:cs="Calibri" w:eastAsia="Calibri" w:hAnsi="Calibri"/>
+          <w:sz w:val="21"/>
+          <w:szCs w:val="21"/>
+        </w:rPr>
+        <w:t xml:space="preserve">Reprise du 7 octobre. Candidate depuis main 91a0fc9 après #186, CI main 37631822824 verte. Journal causal CAPTURE/REFUND consultation append-only, snapshots commission/net, statistiques et CSV propres au médecin actif/vérifié/PRO courant ; activité/notes et créance globale distinctes du montant effectivement reversé. PAYOUT/REFUND externes manuels, verrou/allocation/compensation/idempotence, prise en charge et preuve tracées, anomalies legacy sans backfill. CSV et reçu non fiscal approuvés par le porteur. Aucun fournisseur réel/déploiement déduit des tests ; L8–L11 ouverts. Contrat/recette/revue/suivi : CONTRAT_Finances_L7.md, RECETTE_Finances_L7.md, REVUE_L7_2026-10.md, suivi/LOT_L7.md. Preuves locales : 571 API +117 web, 23 E2E, release:check 11 étapes ; commit applicatif 3c0c9dfb. CI finale à consulter sur la PR, aucune fusion/déploiement automatique.</w:t>
       </w:r>
     </w:p>
     <w:p>

</xml_diff>

<commit_message>
docs: record L8 security review and validation
</commit_message>
<xml_diff>
--- a/docs/Plan_Implementations_Restantes_2026-10.docx
+++ b/docs/Plan_Implementations_Restantes_2026-10.docx
@@ -78,7 +78,7 @@
           <w:sz w:val="21"/>
           <w:szCs w:val="21"/>
         </w:rPr>
-        <w:t xml:space="preserve">Statut : L0 LIVRÉ SUR MAIN, PR #178/#179 fusionnées, CI candidate verte ; L1 LIVRÉ SUR MAIN par PR #181 (53775be) ; L2 LIVRÉ SUR MAIN par PR #182 (eb1ba6e) ; L3 LIVRÉ SUR MAIN par PR #183 (ce1cae8) ; L4 LIVRÉ SUR MAIN par PR #184 (0d3cb74) ; L5 LIVRÉ SUR MAIN par PR #185 (2e5cc77) ; L6 LIVRÉ SUR MAIN par PR #186 (91a0fc9) ; L7 CANDIDATE (preuves/revue/PR : LOT_L7) ; L8–L11 OUVERTS. Mise à jour : 7 octobre 2026. Voir docs/suivi/LOT_L0.md et docs/REVUE_L0_2026-10.md. Aucun déploiement attesté par ce plan.</w:t>
+        <w:t xml:space="preserve">Statut : L0 LIVRÉ SUR MAIN, PR #178/#179 fusionnées, CI candidate verte ; L1 LIVRÉ SUR MAIN par PR #181 (53775be) ; L2 LIVRÉ SUR MAIN par PR #182 (eb1ba6e) ; L3 LIVRÉ SUR MAIN par PR #183 (ce1cae8) ; L4 LIVRÉ SUR MAIN par PR #184 (0d3cb74) ; L5 LIVRÉ SUR MAIN par PR #185 (2e5cc77) ; L6 LIVRÉ SUR MAIN par PR #186 (91a0fc9) ; L7 LIVRÉ SUR MAIN par PR #187 (ebd0547) ; L8 CANDIDATE TECHNIQUE (LOT_L8), gates externes non clos ; L9–L11 OUVERTS. Mise à jour : 7 octobre 2026. Voir docs/suivi/LOT_L0.md et docs/REVUE_L0_2026-10.md. Aucun déploiement attesté par ce plan.</w:t>
       </w:r>
     </w:p>
     <w:p>
@@ -135,7 +135,7 @@
           <w:sz w:val="21"/>
           <w:szCs w:val="21"/>
         </w:rPr>
-        <w:t xml:space="preserve">Statut : L0 LIVRÉ SUR MAIN, PR #178/#179 fusionnées, CI candidate verte ; L1 LIVRÉ SUR MAIN par PR #181 (53775be) ; L2 LIVRÉ SUR MAIN par PR #182 (eb1ba6e) ; L3 LIVRÉ SUR MAIN par PR #183 (ce1cae8) ; L4 LIVRÉ SUR MAIN par PR #184 (0d3cb74) ; L5 LIVRÉ SUR MAIN par PR #185 (2e5cc77) ; L6 LIVRÉ SUR MAIN par PR #186 (91a0fc9) ; L7 CANDIDATE (preuves/revue/PR : LOT_L7) ; L8–L11 OUVERTS. Mise à jour : 7 octobre 2026. Voir docs/suivi/LOT_L0.md et docs/REVUE_L0_2026-10.md. Aucun déploiement attesté par ce plan.</w:t>
+        <w:t xml:space="preserve">Statut : L0 LIVRÉ SUR MAIN, PR #178/#179 fusionnées, CI candidate verte ; L1 LIVRÉ SUR MAIN par PR #181 (53775be) ; L2 LIVRÉ SUR MAIN par PR #182 (eb1ba6e) ; L3 LIVRÉ SUR MAIN par PR #183 (ce1cae8) ; L4 LIVRÉ SUR MAIN par PR #184 (0d3cb74) ; L5 LIVRÉ SUR MAIN par PR #185 (2e5cc77) ; L6 LIVRÉ SUR MAIN par PR #186 (91a0fc9) ; L7 LIVRÉ SUR MAIN par PR #187 (ebd0547) ; L8 CANDIDATE TECHNIQUE (LOT_L8), gates externes non clos ; L9–L11 OUVERTS. Mise à jour : 7 octobre 2026. Voir docs/suivi/LOT_L0.md et docs/REVUE_L0_2026-10.md. Aucun déploiement attesté par ce plan.</w:t>
       </w:r>
     </w:p>
     <w:p>
@@ -2002,7 +2002,7 @@
                 <w:sz w:val="18"/>
                 <w:szCs w:val="18"/>
               </w:rPr>
-              <w:t xml:space="preserve">Candidate feat/l7-revenues-finance-operations ; preuves LOT_L7</w:t>
+              <w:t xml:space="preserve">Livré sur main par PR #187 ; preuves LOT_L7</w:t>
             </w:r>
           </w:p>
         </w:tc>
@@ -2112,7 +2112,7 @@
                 <w:sz w:val="18"/>
                 <w:szCs w:val="18"/>
               </w:rPr>
-              <w:t xml:space="preserve">À traiter</w:t>
+              <w:t xml:space="preserve">Candidate technique feat/l8-security-residuals ; gates externes ouverts, preuves LOT_L8</w:t>
             </w:r>
           </w:p>
         </w:tc>
@@ -3033,7 +3033,7 @@
           <w:sz w:val="21"/>
           <w:szCs w:val="21"/>
         </w:rPr>
-        <w:t xml:space="preserve">Reprise du 7 octobre. Candidate depuis main 91a0fc9 après #186, CI main 37631822824 verte. Journal causal CAPTURE/REFUND consultation append-only, snapshots commission/net, statistiques et CSV propres au médecin actif/vérifié/PRO courant ; activité/notes et créance globale distinctes du montant effectivement reversé. PAYOUT/REFUND externes manuels, verrou/allocation/compensation/idempotence, prise en charge et preuve tracées, anomalies legacy sans backfill. CSV et reçu non fiscal approuvés par le porteur. Aucun fournisseur réel/déploiement déduit des tests ; L8–L11 ouverts. Contrat/recette/revue/suivi : CONTRAT_Finances_L7.md, RECETTE_Finances_L7.md, REVUE_L7_2026-10.md, suivi/LOT_L7.md. Preuves locales : 571 API +117 web, 23 E2E, release:check 11 étapes ; commit applicatif 3c0c9dfb. CI finale à consulter sur la PR, aucune fusion/déploiement automatique.</w:t>
+        <w:t xml:space="preserve">Reprise du 7 octobre. Livré par #187 sur main ebd0547, fusion à 18:07:19 Africa/Lagos, CI finale 37656071002 et CI main 37656606253 réussies. Développé depuis main 91a0fc9 après #186, CI main 37631822824 verte. Journal causal CAPTURE/REFUND consultation append-only, snapshots commission/net, statistiques et CSV propres au médecin actif/vérifié/PRO courant ; activité/notes et créance globale distinctes du montant effectivement reversé. PAYOUT/REFUND externes manuels, verrou/allocation/compensation/idempotence, prise en charge et preuve tracées, anomalies legacy sans backfill. CSV et reçu non fiscal approuvés par le porteur. Aucun fournisseur réel/déploiement déduit des tests ; L8–L11 ouverts. Contrat/recette/revue/suivi : CONTRAT_Finances_L7.md, RECETTE_Finances_L7.md, REVUE_L7_2026-10.md, suivi/LOT_L7.md. Preuves locales : 571 API +117 web, 23 E2E, release:check 11 étapes ; commit applicatif 3c0c9dfb. CI finale à consulter sur la PR, aucune fusion/déploiement automatique.</w:t>
       </w:r>
     </w:p>
     <w:p>
@@ -3126,6 +3126,19 @@
           <w:sz w:val="21"/>
           <w:szCs w:val="21"/>
         </w:rPr>
+        <w:t xml:space="preserve">Reprise du 7 octobre. Branche feat/l8-security-residuals depuis main ebd0547, L7 fusionné et CI main verte. OTP générique/poivré, refresh TTL unique, audit causal/transactions DMP-KYC-labo, logs sans query/Referer/corps brut, Nginx erreurs de requête désactivées, checkout exact partagé et reconcile constant, FCM normalisé/CSP resserrée ; aucun changement de schéma/dépendance. Matrice X1–X15 et périmètre pentest : AUDIT_Securite_L8_2026-10.md. Contrat/revue/preuves : CONTRAT_Securite_L8.md, REVUE_L8_2026-10.md, suivi/LOT_L8.md. Twilio console/HTTPS-HSTS/fournisseurs réels/pentest restent L10/L11 ; unsafe-inline Next et timings réels à arbitrer avant GO, aucun risque accepté fictivement.</w:t>
+      </w:r>
+    </w:p>
+    <w:p>
+      <w:pPr>
+        <w:spacing w:after="110"/>
+      </w:pPr>
+      <w:r>
+        <w:rPr>
+          <w:rFonts w:ascii="Calibri" w:cs="Calibri" w:eastAsia="Calibri" w:hAnsi="Calibri"/>
+          <w:sz w:val="21"/>
+          <w:szCs w:val="21"/>
+        </w:rPr>
         <w:t xml:space="preserve">Travail. Reprendre X4–X15 et les résiduels §5 de AUDIT_Securite_Release_2026-09.md, en tenant compte des fermetures L1/L2/L5. Corriger tri d'audit déterministe, normalisation des liens SW, configuration JWT inutilisée et absence de filtrage des journaux DMP ; revoir OTP/énumération avec les impacts UX documentés. Vérifier CSP compatible, HSTS après certificat et Twilio Geo Permissions. En sous-lot paiement revu : liste blanche des URL fournisseur, suppression des corps d'erreur bruts et comparaison du jeton de réconciliation en temps constant. Conserver le choix fail-closed Redis sauf décision motivée d'exploitation.</w:t>
       </w:r>
     </w:p>
@@ -3153,6 +3166,19 @@
           <w:szCs w:val="21"/>
         </w:rPr>
         <w:t xml:space="preserve">Documentation. Addendum daté, pas réécriture du rapport historique ; CLAUDE.md §8, secrets, Nginx et checklist de release.</w:t>
+      </w:r>
+    </w:p>
+    <w:p>
+      <w:pPr>
+        <w:spacing w:after="110"/>
+      </w:pPr>
+      <w:r>
+        <w:rPr>
+          <w:rFonts w:ascii="Calibri" w:cs="Calibri" w:eastAsia="Calibri" w:hAnsi="Calibri"/>
+          <w:sz w:val="21"/>
+          <w:szCs w:val="21"/>
+        </w:rPr>
+        <w:t xml:space="preserve">Implémentation L8 (7 octobre). Base main ebd0547 après fusion #187 vérifiée. OTP HMAC et consommation unique Redis, réponses publiques génériques, TTL refresh cohérent ; audits causaux et effets/audits L1/L2 transactionnels ; journaux sans paramètres/Referer/corps fournisseur, garde FCM et CSP de production resserrées. Sous-lot paiement revu §3.5 : hôtes checkout exacts, redirections refusées, jeton constant, aucun changement de commission/signature/statuts/effets financiers. 605 tests API +121 web, 28 tests outillage et 11 étapes release verts en 99 s ; 34 migrations sans dérive, aucune migration/dépendance ajoutée. 24 E2E/9 fichiers rejoués avec succès, aucun skip. Chaîne synthétique vérifiée : 2 043 entrées, aucun lien/hash erroné. Contrat, matrice X1–X15, auto-revue et fiche : CONTRAT_Securite_L8.md, AUDIT_Securite_L8_2026-10.md, REVUE_L8_2026-10.md, suivi/LOT_L8.md. Candidate technique uniquement : mesures OTP réelles, Twilio Geo Permissions, HTTPS/HSTS, compatibilité fournisseurs et pentest/arbitrage unsafe-inline restent à prouver avant GO L11 ; aucune acceptation de risque inventée.</w:t>
       </w:r>
     </w:p>
     <w:p>

</xml_diff>

<commit_message>
docs: record L9 preparation and review evidence
</commit_message>
<xml_diff>
--- a/docs/Plan_Implementations_Restantes_2026-10.docx
+++ b/docs/Plan_Implementations_Restantes_2026-10.docx
@@ -78,7 +78,7 @@
           <w:sz w:val="21"/>
           <w:szCs w:val="21"/>
         </w:rPr>
-        <w:t xml:space="preserve">Statut : L0 LIVRÉ SUR MAIN, PR #178/#179 fusionnées, CI candidate verte ; L1 LIVRÉ SUR MAIN par PR #181 (53775be) ; L2 LIVRÉ SUR MAIN par PR #182 (eb1ba6e) ; L3 LIVRÉ SUR MAIN par PR #183 (ce1cae8) ; L4 LIVRÉ SUR MAIN par PR #184 (0d3cb74) ; L5 LIVRÉ SUR MAIN par PR #185 (2e5cc77) ; L6 LIVRÉ SUR MAIN par PR #186 (91a0fc9) ; L7 LIVRÉ SUR MAIN par PR #187 (ebd0547) ; L8 CANDIDATE TECHNIQUE (LOT_L8), gates externes non clos ; L9–L11 OUVERTS. Mise à jour : 7 octobre 2026. Voir docs/suivi/LOT_L0.md et docs/REVUE_L0_2026-10.md. Aucun déploiement attesté par ce plan.</w:t>
+        <w:t xml:space="preserve">Statut : L0 LIVRÉ SUR MAIN, PR #178/#179 fusionnées, CI candidate verte ; L1 LIVRÉ SUR MAIN par PR #181 (53775be) ; L2 LIVRÉ SUR MAIN par PR #182 (eb1ba6e) ; L3 LIVRÉ SUR MAIN par PR #183 (ce1cae8) ; L4 LIVRÉ SUR MAIN par PR #184 (0d3cb74) ; L5 LIVRÉ SUR MAIN par PR #185 (2e5cc77) ; L6 LIVRÉ SUR MAIN par PR #186 (91a0fc9) ; L7 LIVRÉ SUR MAIN par PR #187 (ebd0547) ; L8 LIVRÉ CÔTÉ CODE SUR MAIN par PR #188 (4fc62c1), gates externes non clos ; L9 PRÉPARATION TECHNIQUE CANDIDATE, imports/contreseings ouverts ; L10–L11 OUVERTS. Mise à jour : 8 octobre 2026. Voir docs/suivi/LOT_L0.md et docs/REVUE_L0_2026-10.md. Aucun déploiement attesté par ce plan.</w:t>
       </w:r>
     </w:p>
     <w:p>
@@ -135,7 +135,7 @@
           <w:sz w:val="21"/>
           <w:szCs w:val="21"/>
         </w:rPr>
-        <w:t xml:space="preserve">Statut : L0 LIVRÉ SUR MAIN, PR #178/#179 fusionnées, CI candidate verte ; L1 LIVRÉ SUR MAIN par PR #181 (53775be) ; L2 LIVRÉ SUR MAIN par PR #182 (eb1ba6e) ; L3 LIVRÉ SUR MAIN par PR #183 (ce1cae8) ; L4 LIVRÉ SUR MAIN par PR #184 (0d3cb74) ; L5 LIVRÉ SUR MAIN par PR #185 (2e5cc77) ; L6 LIVRÉ SUR MAIN par PR #186 (91a0fc9) ; L7 LIVRÉ SUR MAIN par PR #187 (ebd0547) ; L8 CANDIDATE TECHNIQUE (LOT_L8), gates externes non clos ; L9–L11 OUVERTS. Mise à jour : 7 octobre 2026. Voir docs/suivi/LOT_L0.md et docs/REVUE_L0_2026-10.md. Aucun déploiement attesté par ce plan.</w:t>
+        <w:t xml:space="preserve">Statut : L0 LIVRÉ SUR MAIN, PR #178/#179 fusionnées, CI candidate verte ; L1 LIVRÉ SUR MAIN par PR #181 (53775be) ; L2 LIVRÉ SUR MAIN par PR #182 (eb1ba6e) ; L3 LIVRÉ SUR MAIN par PR #183 (ce1cae8) ; L4 LIVRÉ SUR MAIN par PR #184 (0d3cb74) ; L5 LIVRÉ SUR MAIN par PR #185 (2e5cc77) ; L6 LIVRÉ SUR MAIN par PR #186 (91a0fc9) ; L7 LIVRÉ SUR MAIN par PR #187 (ebd0547) ; L8 LIVRÉ CÔTÉ CODE SUR MAIN par PR #188 (4fc62c1), gates externes non clos ; L9 PRÉPARATION TECHNIQUE CANDIDATE, imports/contreseings ouverts ; L10–L11 OUVERTS. Mise à jour : 8 octobre 2026. Voir docs/suivi/LOT_L0.md et docs/REVUE_L0_2026-10.md. Aucun déploiement attesté par ce plan.</w:t>
       </w:r>
     </w:p>
     <w:p>
@@ -2112,7 +2112,7 @@
                 <w:sz w:val="18"/>
                 <w:szCs w:val="18"/>
               </w:rPr>
-              <w:t xml:space="preserve">Candidate technique feat/l8-security-residuals ; gates externes ouverts, preuves LOT_L8</w:t>
+              <w:t xml:space="preserve">Livré côté code sur main par #188 ; gates externes ouverts, preuves LOT_L8</w:t>
             </w:r>
           </w:p>
         </w:tc>
@@ -2222,7 +2222,7 @@
                 <w:sz w:val="18"/>
                 <w:szCs w:val="18"/>
               </w:rPr>
-              <w:t xml:space="preserve">Preuves externes à obtenir</w:t>
+              <w:t xml:space="preserve">Candidate technique feat/l9-native-clinical-validation ; retours annoncés/références différées, imports et contreseings ouverts</w:t>
             </w:r>
           </w:p>
         </w:tc>
@@ -3261,6 +3261,19 @@
           <w:szCs w:val="21"/>
         </w:rPr>
         <w:t xml:space="preserve">Documentation. Dossier clinique, registre de traductions, suivis B1/B2, recette SOS et actualisation des références dans CLAUDE.md.</w:t>
+      </w:r>
+    </w:p>
+    <w:p>
+      <w:pPr>
+        <w:spacing w:after="110"/>
+      </w:pPr>
+      <w:r>
+        <w:rPr>
+          <w:rFonts w:ascii="Calibri" w:cs="Calibri" w:eastAsia="Calibri" w:hAnsi="Calibri"/>
+          <w:sz w:val="21"/>
+          <w:szCs w:val="21"/>
+        </w:rPr>
+        <w:t xml:space="preserve">Exécution L9 (8 octobre). Base main 4fc62c1, fusion #188 à 06:50:09 Africa/Lagos et CI main 37734382622 réussie. Préparation/contrôles d’import natif et de version, CSV strict, source FR/EN et variables, double relecture/date/référence, traçabilité/rollback, MT critique interdite. Corpus complet : 1 098 clés UI +27 phrases ; FON/YOR 232 manquantes/6 SOS chacun, inchangées. Nouveau dossier clinique non signé depuis sources fraîches, CPN/objectifs et posologie inclus ; ancien dossier en circulation intact. 44 tests d’outillage, lint/typecheck, instantanés et DOCX structurels verts. Références des retours validés annoncées mais différées par le porteur : aucune pièce/native/signature importée ou attestée, registre vide et gate non vert attendu. Rendu posologie (fractions/mg, horaires et durée déduits) à corriger/arbitrer explicitement avant ouverture. Lire contrat/revue/fiche L9 ; CI technique ne ferme pas les validations humaines ni GO L11.</w:t>
       </w:r>
     </w:p>
     <w:p>

</xml_diff>

<commit_message>
docs: record L10 review and Claude Code preproduction workflow
</commit_message>
<xml_diff>
--- a/docs/Plan_Implementations_Restantes_2026-10.docx
+++ b/docs/Plan_Implementations_Restantes_2026-10.docx
@@ -78,7 +78,7 @@
           <w:sz w:val="21"/>
           <w:szCs w:val="21"/>
         </w:rPr>
-        <w:t xml:space="preserve">Statut : L0 LIVRÉ SUR MAIN, PR #178/#179 fusionnées, CI candidate verte ; L1 LIVRÉ SUR MAIN par PR #181 (53775be) ; L2 LIVRÉ SUR MAIN par PR #182 (eb1ba6e) ; L3 LIVRÉ SUR MAIN par PR #183 (ce1cae8) ; L4 LIVRÉ SUR MAIN par PR #184 (0d3cb74) ; L5 LIVRÉ SUR MAIN par PR #185 (2e5cc77) ; L6 LIVRÉ SUR MAIN par PR #186 (91a0fc9) ; L7 LIVRÉ SUR MAIN par PR #187 (ebd0547) ; L8 LIVRÉ CÔTÉ CODE SUR MAIN par PR #188 (4fc62c1), gates externes non clos ; L9 PRÉPARATION TECHNIQUE CANDIDATE, imports/contreseings ouverts ; L10–L11 OUVERTS. Mise à jour : 8 octobre 2026. Voir docs/suivi/LOT_L0.md et docs/REVUE_L0_2026-10.md. Aucun déploiement attesté par ce plan.</w:t>
+        <w:t xml:space="preserve">Statut : L0 LIVRÉ SUR MAIN, PR #178/#179 fusionnées, CI candidate verte ; L1 LIVRÉ SUR MAIN par PR #181 (53775be) ; L2 LIVRÉ SUR MAIN par PR #182 (eb1ba6e) ; L3 LIVRÉ SUR MAIN par PR #183 (ce1cae8) ; L4 LIVRÉ SUR MAIN par PR #184 (0d3cb74) ; L5 LIVRÉ SUR MAIN par PR #185 (2e5cc77) ; L6 LIVRÉ SUR MAIN par PR #186 (91a0fc9) ; L7 LIVRÉ SUR MAIN par PR #187 (ebd0547) ; L8 LIVRÉ CÔTÉ CODE SUR MAIN par PR #188 (4fc62c1), gates externes non clos ; L9 PRÉPARATION TECHNIQUE LIVRÉE SUR MAIN par #189 (a3f80a1), imports/contreseings ouverts ; L10 OUTILLAGE CANDIDAT, accès ultérieurs/recettes ouvertes ; L11 OUVERT. Mise à jour : 8 octobre 2026. Voir docs/suivi/LOT_L0.md et docs/REVUE_L0_2026-10.md. Aucun déploiement attesté par ce plan.</w:t>
       </w:r>
     </w:p>
     <w:p>
@@ -135,7 +135,7 @@
           <w:sz w:val="21"/>
           <w:szCs w:val="21"/>
         </w:rPr>
-        <w:t xml:space="preserve">Statut : L0 LIVRÉ SUR MAIN, PR #178/#179 fusionnées, CI candidate verte ; L1 LIVRÉ SUR MAIN par PR #181 (53775be) ; L2 LIVRÉ SUR MAIN par PR #182 (eb1ba6e) ; L3 LIVRÉ SUR MAIN par PR #183 (ce1cae8) ; L4 LIVRÉ SUR MAIN par PR #184 (0d3cb74) ; L5 LIVRÉ SUR MAIN par PR #185 (2e5cc77) ; L6 LIVRÉ SUR MAIN par PR #186 (91a0fc9) ; L7 LIVRÉ SUR MAIN par PR #187 (ebd0547) ; L8 LIVRÉ CÔTÉ CODE SUR MAIN par PR #188 (4fc62c1), gates externes non clos ; L9 PRÉPARATION TECHNIQUE CANDIDATE, imports/contreseings ouverts ; L10–L11 OUVERTS. Mise à jour : 8 octobre 2026. Voir docs/suivi/LOT_L0.md et docs/REVUE_L0_2026-10.md. Aucun déploiement attesté par ce plan.</w:t>
+        <w:t xml:space="preserve">Statut : L0 LIVRÉ SUR MAIN, PR #178/#179 fusionnées, CI candidate verte ; L1 LIVRÉ SUR MAIN par PR #181 (53775be) ; L2 LIVRÉ SUR MAIN par PR #182 (eb1ba6e) ; L3 LIVRÉ SUR MAIN par PR #183 (ce1cae8) ; L4 LIVRÉ SUR MAIN par PR #184 (0d3cb74) ; L5 LIVRÉ SUR MAIN par PR #185 (2e5cc77) ; L6 LIVRÉ SUR MAIN par PR #186 (91a0fc9) ; L7 LIVRÉ SUR MAIN par PR #187 (ebd0547) ; L8 LIVRÉ CÔTÉ CODE SUR MAIN par PR #188 (4fc62c1), gates externes non clos ; L9 PRÉPARATION TECHNIQUE LIVRÉE SUR MAIN par #189 (a3f80a1), imports/contreseings ouverts ; L10 OUTILLAGE CANDIDAT, accès ultérieurs/recettes ouvertes ; L11 OUVERT. Mise à jour : 8 octobre 2026. Voir docs/suivi/LOT_L0.md et docs/REVUE_L0_2026-10.md. Aucun déploiement attesté par ce plan.</w:t>
       </w:r>
     </w:p>
     <w:p>
@@ -2222,7 +2222,7 @@
                 <w:sz w:val="18"/>
                 <w:szCs w:val="18"/>
               </w:rPr>
-              <w:t xml:space="preserve">Candidate technique feat/l9-native-clinical-validation ; retours annoncés/références différées, imports et contreseings ouverts</w:t>
+              <w:t xml:space="preserve">Préparation technique livrée #189/a3f80a1 ; références différées, imports et contreseings ouverts</w:t>
             </w:r>
           </w:p>
         </w:tc>
@@ -2332,7 +2332,7 @@
                 <w:sz w:val="18"/>
                 <w:szCs w:val="18"/>
               </w:rPr>
-              <w:t xml:space="preserve">À exécuter</w:t>
+              <w:t xml:space="preserve">Outillage candidat feat/l10-preproduction-readiness ; accès ultérieurs/recettes ouvertes</w:t>
             </w:r>
           </w:p>
         </w:tc>
@@ -3301,7 +3301,7 @@
           <w:sz w:val="21"/>
           <w:szCs w:val="21"/>
         </w:rPr>
-        <w:t xml:space="preserve">Travail. Environnement isolé représentatif de production : PostgreSQL natif, Redis, Nginx/HTTPS, PM2, secrets et crons. Préparer tôt domaine, comptes et clés ; ne pas utiliser la base production dans les outils de développement. La CI possède déjà un job deploy gated par vars.DEPLOY_ENABLED == 'true' : vérifier sa configuration, ne pas traiter ce job comme commenté.</w:t>
+        <w:t xml:space="preserve">Travail. Environnement isolé représentatif de production : PostgreSQL natif, Redis, Nginx/HTTPS, PM2, secrets et crons. Préparer tôt domaine, comptes et clés ; ne pas utiliser la base production dans les outils de développement. La CI possède déjà un job deploy gated par vars.DEPLOY_ENABLED == 'true' et vars.DEPLOY_MAINTENANCE_READY == 'true' : vérifier sa configuration, ne pas traiter ce job comme commenté.</w:t>
       </w:r>
     </w:p>
     <w:p>
@@ -3341,6 +3341,19 @@
           <w:szCs w:val="21"/>
         </w:rPr>
         <w:t xml:space="preserve">Documentation. Suivis B3/B4, fiches fournisseurs, checklist de déploiement, inventaire de secrets sans valeurs, version candidate et preuves.</w:t>
+      </w:r>
+    </w:p>
+    <w:p>
+      <w:pPr>
+        <w:spacing w:after="110"/>
+      </w:pPr>
+      <w:r>
+        <w:rPr>
+          <w:rFonts w:ascii="Calibri" w:cs="Calibri" w:eastAsia="Calibri" w:hAnsi="Calibri"/>
+          <w:sz w:val="21"/>
+          <w:szCs w:val="21"/>
+        </w:rPr>
+        <w:t xml:space="preserve">Exécution L10 (8 octobre). Base main a3f80a1 après fusion #189 à 10:32:49 Africa/Lagos, CI main 37757404974 réussie. Porteur : préparer l’outillage, accès à fournir ultérieurement. Workflow préproduction manuel sur SHA main qualifié et fingerprint/maintenance, arrêt homogène avant migrations, setup smoke sans purge Redis ni mode test, FedaPay sandbox refus live avant réseau. Sauvegarde complète avec snapshot commun dump/manifest DB, deux archives et publication manifeste en dernier ; sondes sans tâches mutantes par défaut. 94 cas préparés, registre vide, gate L10 non vert attendu. 65 régressions d’outillage, lint/typecheck et preuve PG16/restauration locale synthétique verts ; aucune cible native/recette réelle attestée. Contrat/revue/suivi/inventaire L10 et dossier de preuves à reprendre. L9 humain et GO L11 restent ouverts.</w:t>
       </w:r>
     </w:p>
     <w:p>
@@ -4682,7 +4695,7 @@
       </w:r>
     </w:p>
     <w:sectPr>
-      <w:footerReference w:type="default" r:id="rId7"/>
+      <w:footerReference w:type="default" r:id="rId6"/>
       <w:pgSz w:w="11906" w:h="16838" w:orient="portrait"/>
       <w:pgMar w:top="1440" w:right="1440" w:bottom="1440" w:left="1440" w:header="708" w:footer="708" w:gutter="0"/>
       <w:pgNumType/>
@@ -4694,43 +4707,6 @@
 
 <file path=word/comments.xml><?xml version="1.0" encoding="utf-8"?>
 <w:comments xmlns:cx="http://schemas.microsoft.com/office/drawing/2014/chartex" xmlns:cx1="http://schemas.microsoft.com/office/drawing/2015/9/8/chartex" xmlns:cx2="http://schemas.microsoft.com/office/drawing/2015/10/21/chartex" xmlns:cx3="http://schemas.microsoft.com/office/drawing/2016/5/9/chartex" xmlns:cx4="http://schemas.microsoft.com/office/drawing/2016/5/10/chartex" xmlns:cx5="http://schemas.microsoft.com/office/drawing/2016/5/11/chartex" xmlns:cx6="http://schemas.microsoft.com/office/drawing/2016/5/12/chartex" xmlns:cx7="http://schemas.microsoft.com/office/drawing/2016/5/13/chartex" xmlns:cx8="http://schemas.microsoft.com/office/drawing/2016/5/14/chartex" xmlns:mc="http://schemas.openxmlformats.org/markup-compatibility/2006" xmlns:aink="http://schemas.microsoft.com/office/drawing/2016/ink" xmlns:am3d="http://schemas.microsoft.com/office/drawing/2017/model3d" xmlns:o="urn:schemas-microsoft-com:office:office" xmlns:r="http://schemas.openxmlformats.org/officeDocument/2006/relationships" xmlns:m="http://schemas.openxmlformats.org/officeDocument/2006/math" xmlns:v="urn:schemas-microsoft-com:vml" xmlns:wp14="http://schemas.microsoft.com/office/word/2010/wordprocessingDrawing" xmlns:wp="http://schemas.openxmlformats.org/drawingml/2006/wordprocessingDrawing" xmlns:w10="urn:schemas-microsoft-com:office:word" xmlns:w="http://schemas.openxmlformats.org/wordprocessingml/2006/main" xmlns:w14="http://schemas.microsoft.com/office/word/2010/wordml" xmlns:w15="http://schemas.microsoft.com/office/word/2012/wordml" xmlns:w16cex="http://schemas.microsoft.com/office/word/2018/wordml/cex" xmlns:w16cid="http://schemas.microsoft.com/office/word/2016/wordml/cid" xmlns:w16="http://schemas.microsoft.com/office/word/2018/wordml" xmlns:w16sdtdh="http://schemas.microsoft.com/office/word/2020/wordml/sdtdatahash" xmlns:w16se="http://schemas.microsoft.com/office/word/2015/wordml/symex" xmlns:wpg="http://schemas.microsoft.com/office/word/2010/wordprocessingGroup" xmlns:wpi="http://schemas.microsoft.com/office/word/2010/wordprocessingInk" xmlns:wne="http://schemas.microsoft.com/office/word/2006/wordml" xmlns:wps="http://schemas.microsoft.com/office/word/2010/wordprocessingShape"/>
-</file>
-
-<file path=word/endnotes.xml><?xml version="1.0" encoding="utf-8"?>
-<w:endnotes xmlns:wpc="http://schemas.microsoft.com/office/word/2010/wordprocessingCanvas" xmlns:mc="http://schemas.openxmlformats.org/markup-compatibility/2006" xmlns:o="urn:schemas-microsoft-com:office:office" xmlns:r="http://schemas.openxmlformats.org/officeDocument/2006/relationships" xmlns:m="http://schemas.openxmlformats.org/officeDocument/2006/math" xmlns:v="urn:schemas-microsoft-com:vml" xmlns:wp14="http://schemas.microsoft.com/office/word/2010/wordprocessingDrawing" xmlns:wp="http://schemas.openxmlformats.org/drawingml/2006/wordprocessingDrawing" xmlns:w10="urn:schemas-microsoft-com:office:word" xmlns:w="http://schemas.openxmlformats.org/wordprocessingml/2006/main" xmlns:w14="http://schemas.microsoft.com/office/word/2010/wordml" xmlns:w15="http://schemas.microsoft.com/office/word/2012/wordml" xmlns:wpg="http://schemas.microsoft.com/office/word/2010/wordprocessingGroup" xmlns:wpi="http://schemas.microsoft.com/office/word/2010/wordprocessingInk" xmlns:wne="http://schemas.microsoft.com/office/word/2006/wordml" xmlns:wps="http://schemas.microsoft.com/office/word/2010/wordprocessingShape" mc:Ignorable="w14 w15 wp14">
-  <w:endnote w:type="separator" w:id="-1">
-    <w:p>
-      <w:pPr>
-        <w:spacing w:after="0" w:line="240" w:lineRule="auto"/>
-      </w:pPr>
-      <w:r>
-        <w:rPr>
-          <w:rStyle w:val="EndnoteReference"/>
-        </w:rPr>
-        <w:endnoteRef/>
-      </w:r>
-      <w:r>
-        <w:separator/>
-      </w:r>
-    </w:p>
-  </w:endnote>
-  <w:endnote w:type="continuationSeparator" w:id="0">
-    <w:p>
-      <w:pPr>
-        <w:spacing w:after="0" w:line="240" w:lineRule="auto"/>
-      </w:pPr>
-      <w:r>
-        <w:rPr>
-          <w:rStyle w:val="EndnoteReference"/>
-        </w:rPr>
-        <w:endnoteRef/>
-      </w:r>
-      <w:r>
-        <w:continuationSeparator/>
-      </w:r>
-    </w:p>
-  </w:endnote>
-</w:endnotes>
 </file>
 
 <file path=word/footer1.xml><?xml version="1.0" encoding="utf-8"?>
@@ -5038,42 +5014,5 @@
       <w:szCs w:val="20"/>
     </w:rPr>
   </w:style>
-  <w:style w:type="character" w:styleId="EndnoteReference">
-    <w:name w:val="endnote reference"/>
-    <w:basedOn w:val="DefaultParagraphFont"/>
-    <w:uiPriority w:val="99"/>
-    <w:semiHidden/>
-    <w:unhideWhenUsed/>
-    <w:rPr>
-      <w:vertAlign w:val="superscript"/>
-    </w:rPr>
-  </w:style>
-  <w:style w:type="paragraph" w:styleId="EndnoteText">
-    <w:name w:val="endnote text"/>
-    <w:basedOn w:val="Normal"/>
-    <w:link w:val="EndnoteTextChar"/>
-    <w:uiPriority w:val="99"/>
-    <w:semiHidden/>
-    <w:unhideWhenUsed/>
-    <w:pPr>
-      <w:spacing w:after="0" w:line="240" w:lineRule="auto"/>
-    </w:pPr>
-    <w:rPr>
-      <w:sz w:val="20"/>
-      <w:szCs w:val="20"/>
-    </w:rPr>
-  </w:style>
-  <w:style w:type="character" w:styleId="EndnoteTextChar">
-    <w:name w:val="Endnote Text Char"/>
-    <w:basedOn w:val="DefaultParagraphFont"/>
-    <w:link w:val="EndnoteText"/>
-    <w:uiPriority w:val="99"/>
-    <w:semiHidden/>
-    <w:unhideWhenUsed/>
-    <w:rPr>
-      <w:sz w:val="20"/>
-      <w:szCs w:val="20"/>
-    </w:rPr>
-  </w:style>
 </w:styles>
 </file>
</xml_diff>

<commit_message>
fix: close security, workflow and deployment review findings
</commit_message>
<xml_diff>
--- a/docs/Plan_Implementations_Restantes_2026-10.docx
+++ b/docs/Plan_Implementations_Restantes_2026-10.docx
@@ -162,6 +162,19 @@
           <w:szCs w:val="21"/>
         </w:rPr>
         <w:t xml:space="preserve">Version documentaire : docs/Plan_Implementations_Restantes_2026-10.docx, générée depuis ce fichier par scripts/docs/generate-implementation-plan.js.</w:t>
+      </w:r>
+    </w:p>
+    <w:p>
+      <w:pPr>
+        <w:spacing w:after="110"/>
+      </w:pPr>
+      <w:r>
+        <w:rPr>
+          <w:rFonts w:ascii="Calibri" w:cs="Calibri" w:eastAsia="Calibri" w:hAnsi="Calibri"/>
+          <w:sz w:val="21"/>
+          <w:szCs w:val="21"/>
+        </w:rPr>
+        <w:t xml:space="preserve">Reprise du 14 octobre 2026 sur main b974080 : L10 outillage/provisioning IONOS et sonde S8 déjà intégrés ; les recettes cibles et fournisseurs restent ouvertes. Revue/corrections complémentaires sur codex/full-review-2026-10-14 : voir docs/REVUE_Complete_Codex_2026-10-14.md et docs/suivi/LOT_Revue_2026-10-14.md. Ces changements sont candidats tant que la PR et sa CI ne sont pas acceptées. L9 humain et L11 restent ouverts ; aucune ouverture production déduite des tests locaux.</w:t>
       </w:r>
     </w:p>
     <w:p>
@@ -263,7 +276,7 @@
           <w:sz w:val="21"/>
           <w:szCs w:val="21"/>
         </w:rPr>
-        <w:t xml:space="preserve">Stack : Next.js 14/App Router, Fastify, Prisma, PostgreSQL 16 natif en production, Redis, VPS Infomaniak ; Node 24 et pnpm du package.json.</w:t>
+        <w:t xml:space="preserve">Stack : Next.js 14/App Router, Fastify, Prisma, PostgreSQL 18.6 natif sur le VPS IONOS partagé, Valkey 6379, bases/rôles distincts et index /5 préproduction, /6 production ; Node 24 et pnpm du package.json. Dérogation porteur du 13 octobre 2026 : ports 3100/3101 et 3200/3201 ; PostgreSQL 16/Redis en conteneurs restent la pile de test.</w:t>
       </w:r>
     </w:p>
     <w:p>
@@ -4695,7 +4708,7 @@
       </w:r>
     </w:p>
     <w:sectPr>
-      <w:footerReference w:type="default" r:id="rId6"/>
+      <w:footerReference w:type="default" r:id="rId7"/>
       <w:pgSz w:w="11906" w:h="16838" w:orient="portrait"/>
       <w:pgMar w:top="1440" w:right="1440" w:bottom="1440" w:left="1440" w:header="708" w:footer="708" w:gutter="0"/>
       <w:pgNumType/>
@@ -4707,6 +4720,43 @@
 
 <file path=word/comments.xml><?xml version="1.0" encoding="utf-8"?>
 <w:comments xmlns:cx="http://schemas.microsoft.com/office/drawing/2014/chartex" xmlns:cx1="http://schemas.microsoft.com/office/drawing/2015/9/8/chartex" xmlns:cx2="http://schemas.microsoft.com/office/drawing/2015/10/21/chartex" xmlns:cx3="http://schemas.microsoft.com/office/drawing/2016/5/9/chartex" xmlns:cx4="http://schemas.microsoft.com/office/drawing/2016/5/10/chartex" xmlns:cx5="http://schemas.microsoft.com/office/drawing/2016/5/11/chartex" xmlns:cx6="http://schemas.microsoft.com/office/drawing/2016/5/12/chartex" xmlns:cx7="http://schemas.microsoft.com/office/drawing/2016/5/13/chartex" xmlns:cx8="http://schemas.microsoft.com/office/drawing/2016/5/14/chartex" xmlns:mc="http://schemas.openxmlformats.org/markup-compatibility/2006" xmlns:aink="http://schemas.microsoft.com/office/drawing/2016/ink" xmlns:am3d="http://schemas.microsoft.com/office/drawing/2017/model3d" xmlns:o="urn:schemas-microsoft-com:office:office" xmlns:r="http://schemas.openxmlformats.org/officeDocument/2006/relationships" xmlns:m="http://schemas.openxmlformats.org/officeDocument/2006/math" xmlns:v="urn:schemas-microsoft-com:vml" xmlns:wp14="http://schemas.microsoft.com/office/word/2010/wordprocessingDrawing" xmlns:wp="http://schemas.openxmlformats.org/drawingml/2006/wordprocessingDrawing" xmlns:w10="urn:schemas-microsoft-com:office:word" xmlns:w="http://schemas.openxmlformats.org/wordprocessingml/2006/main" xmlns:w14="http://schemas.microsoft.com/office/word/2010/wordml" xmlns:w15="http://schemas.microsoft.com/office/word/2012/wordml" xmlns:w16cex="http://schemas.microsoft.com/office/word/2018/wordml/cex" xmlns:w16cid="http://schemas.microsoft.com/office/word/2016/wordml/cid" xmlns:w16="http://schemas.microsoft.com/office/word/2018/wordml" xmlns:w16sdtdh="http://schemas.microsoft.com/office/word/2020/wordml/sdtdatahash" xmlns:w16se="http://schemas.microsoft.com/office/word/2015/wordml/symex" xmlns:wpg="http://schemas.microsoft.com/office/word/2010/wordprocessingGroup" xmlns:wpi="http://schemas.microsoft.com/office/word/2010/wordprocessingInk" xmlns:wne="http://schemas.microsoft.com/office/word/2006/wordml" xmlns:wps="http://schemas.microsoft.com/office/word/2010/wordprocessingShape"/>
+</file>
+
+<file path=word/endnotes.xml><?xml version="1.0" encoding="utf-8"?>
+<w:endnotes xmlns:wpc="http://schemas.microsoft.com/office/word/2010/wordprocessingCanvas" xmlns:mc="http://schemas.openxmlformats.org/markup-compatibility/2006" xmlns:o="urn:schemas-microsoft-com:office:office" xmlns:r="http://schemas.openxmlformats.org/officeDocument/2006/relationships" xmlns:m="http://schemas.openxmlformats.org/officeDocument/2006/math" xmlns:v="urn:schemas-microsoft-com:vml" xmlns:wp14="http://schemas.microsoft.com/office/word/2010/wordprocessingDrawing" xmlns:wp="http://schemas.openxmlformats.org/drawingml/2006/wordprocessingDrawing" xmlns:w10="urn:schemas-microsoft-com:office:word" xmlns:w="http://schemas.openxmlformats.org/wordprocessingml/2006/main" xmlns:w14="http://schemas.microsoft.com/office/word/2010/wordml" xmlns:w15="http://schemas.microsoft.com/office/word/2012/wordml" xmlns:wpg="http://schemas.microsoft.com/office/word/2010/wordprocessingGroup" xmlns:wpi="http://schemas.microsoft.com/office/word/2010/wordprocessingInk" xmlns:wne="http://schemas.microsoft.com/office/word/2006/wordml" xmlns:wps="http://schemas.microsoft.com/office/word/2010/wordprocessingShape" mc:Ignorable="w14 w15 wp14">
+  <w:endnote w:type="separator" w:id="-1">
+    <w:p>
+      <w:pPr>
+        <w:spacing w:after="0" w:line="240" w:lineRule="auto"/>
+      </w:pPr>
+      <w:r>
+        <w:rPr>
+          <w:rStyle w:val="EndnoteReference"/>
+        </w:rPr>
+        <w:endnoteRef/>
+      </w:r>
+      <w:r>
+        <w:separator/>
+      </w:r>
+    </w:p>
+  </w:endnote>
+  <w:endnote w:type="continuationSeparator" w:id="0">
+    <w:p>
+      <w:pPr>
+        <w:spacing w:after="0" w:line="240" w:lineRule="auto"/>
+      </w:pPr>
+      <w:r>
+        <w:rPr>
+          <w:rStyle w:val="EndnoteReference"/>
+        </w:rPr>
+        <w:endnoteRef/>
+      </w:r>
+      <w:r>
+        <w:continuationSeparator/>
+      </w:r>
+    </w:p>
+  </w:endnote>
+</w:endnotes>
 </file>
 
 <file path=word/footer1.xml><?xml version="1.0" encoding="utf-8"?>
@@ -5014,5 +5064,42 @@
       <w:szCs w:val="20"/>
     </w:rPr>
   </w:style>
+  <w:style w:type="character" w:styleId="EndnoteReference">
+    <w:name w:val="endnote reference"/>
+    <w:basedOn w:val="DefaultParagraphFont"/>
+    <w:uiPriority w:val="99"/>
+    <w:semiHidden/>
+    <w:unhideWhenUsed/>
+    <w:rPr>
+      <w:vertAlign w:val="superscript"/>
+    </w:rPr>
+  </w:style>
+  <w:style w:type="paragraph" w:styleId="EndnoteText">
+    <w:name w:val="endnote text"/>
+    <w:basedOn w:val="Normal"/>
+    <w:link w:val="EndnoteTextChar"/>
+    <w:uiPriority w:val="99"/>
+    <w:semiHidden/>
+    <w:unhideWhenUsed/>
+    <w:pPr>
+      <w:spacing w:after="0" w:line="240" w:lineRule="auto"/>
+    </w:pPr>
+    <w:rPr>
+      <w:sz w:val="20"/>
+      <w:szCs w:val="20"/>
+    </w:rPr>
+  </w:style>
+  <w:style w:type="character" w:styleId="EndnoteTextChar">
+    <w:name w:val="Endnote Text Char"/>
+    <w:basedOn w:val="DefaultParagraphFont"/>
+    <w:link w:val="EndnoteText"/>
+    <w:uiPriority w:val="99"/>
+    <w:semiHidden/>
+    <w:unhideWhenUsed/>
+    <w:rPr>
+      <w:sz w:val="20"/>
+      <w:szCs w:val="20"/>
+    </w:rPr>
+  </w:style>
 </w:styles>
 </file>
</xml_diff>